<commit_message>
update: tugas 2 chart
</commit_message>
<xml_diff>
--- a/week-3/Tugas2_MuhamadFaqihAzhar_0110221092_5TI01.docx
+++ b/week-3/Tugas2_MuhamadFaqihAzhar_0110221092_5TI01.docx
@@ -593,6 +593,7 @@
       <w:r>
         <w:rPr>
           <w:rFonts w:cs="Times New Roman"/>
+          <w:noProof/>
           <w:shd w:val="clear" w:color="auto" w:fill="FF6600"/>
         </w:rPr>
         <w:drawing>
@@ -611,7 +612,7 @@
                     <pic:cNvPicPr/>
                   </pic:nvPicPr>
                   <pic:blipFill>
-                    <a:blip r:embed="rId5"/>
+                    <a:blip r:embed="rId7"/>
                     <a:stretch>
                       <a:fillRect/>
                     </a:stretch>
@@ -1692,6 +1693,9 @@
         <w:jc w:val="left"/>
       </w:pPr>
       <w:r>
+        <w:rPr>
+          <w:noProof/>
+        </w:rPr>
         <w:drawing>
           <wp:inline distT="0" distB="0" distL="0" distR="0" wp14:anchorId="75AA8347" wp14:editId="297B1FF3">
             <wp:extent cx="3600000" cy="1171416"/>
@@ -1708,7 +1712,7 @@
                     <pic:cNvPicPr/>
                   </pic:nvPicPr>
                   <pic:blipFill>
-                    <a:blip r:embed="rId6"/>
+                    <a:blip r:embed="rId8"/>
                     <a:stretch>
                       <a:fillRect/>
                     </a:stretch>
@@ -1795,15 +1799,7 @@
                 <w:b/>
                 <w:bCs/>
               </w:rPr>
-              <w:t>M</w:t>
-            </w:r>
-            <w:r>
-              <w:rPr>
-                <w:rFonts w:ascii="Courier New" w:hAnsi="Courier New" w:cs="Courier New"/>
-                <w:b/>
-                <w:bCs/>
-              </w:rPr>
-              <w:t>ax Value</w:t>
+              <w:t>Max Value</w:t>
             </w:r>
           </w:p>
         </w:tc>
@@ -2028,25 +2024,7 @@
               <w:rPr>
                 <w:rFonts w:ascii="Courier New" w:hAnsi="Courier New" w:cs="Courier New"/>
               </w:rPr>
-              <w:t>ax Value</w:t>
-            </w:r>
-            <w:r>
-              <w:rPr>
-                <w:rFonts w:ascii="Courier New" w:hAnsi="Courier New" w:cs="Courier New"/>
-              </w:rPr>
-              <w:t xml:space="preserve"> - </w:t>
-            </w:r>
-            <w:r>
-              <w:rPr>
-                <w:rFonts w:ascii="Courier New" w:hAnsi="Courier New" w:cs="Courier New"/>
-              </w:rPr>
-              <w:t>Min Value</w:t>
-            </w:r>
-            <w:r>
-              <w:rPr>
-                <w:rFonts w:ascii="Courier New" w:hAnsi="Courier New" w:cs="Courier New"/>
-              </w:rPr>
-              <w:t xml:space="preserve"> + 1</w:t>
+              <w:t>ax Value - Min Value + 1</w:t>
             </w:r>
           </w:p>
         </w:tc>
@@ -2424,25 +2402,7 @@
               <w:rPr>
                 <w:rFonts w:ascii="Courier New" w:hAnsi="Courier New" w:cs="Courier New"/>
               </w:rPr>
-              <w:t>(</w:t>
-            </w:r>
-            <w:r>
-              <w:rPr>
-                <w:rFonts w:ascii="Courier New" w:hAnsi="Courier New" w:cs="Courier New"/>
-              </w:rPr>
-              <w:t>3</w:t>
-            </w:r>
-            <w:r>
-              <w:rPr>
-                <w:rFonts w:ascii="Courier New" w:hAnsi="Courier New" w:cs="Courier New"/>
-              </w:rPr>
-              <w:t xml:space="preserve"> – 1) × </w:t>
-            </w:r>
-            <w:r>
-              <w:rPr>
-                <w:rFonts w:ascii="Courier New" w:hAnsi="Courier New" w:cs="Courier New"/>
-              </w:rPr>
-              <w:t>0.375</w:t>
+              <w:t>(3 – 1) × 0.375</w:t>
             </w:r>
           </w:p>
         </w:tc>
@@ -2871,15 +2831,7 @@
                 <w:b/>
                 <w:bCs/>
               </w:rPr>
-              <w:t>2.0625</w:t>
-            </w:r>
-            <w:r>
-              <w:rPr>
-                <w:rFonts w:ascii="Courier New" w:hAnsi="Courier New" w:cs="Courier New"/>
-                <w:b/>
-                <w:bCs/>
-              </w:rPr>
-              <w:t xml:space="preserve"> </w:t>
+              <w:t xml:space="preserve">2.0625 </w:t>
             </w:r>
             <w:r>
               <w:rPr>
@@ -3242,15 +3194,7 @@
                 <w:b/>
                 <w:bCs/>
               </w:rPr>
-              <w:t>2.8125</w:t>
-            </w:r>
-            <w:r>
-              <w:rPr>
-                <w:rFonts w:ascii="Courier New" w:hAnsi="Courier New" w:cs="Courier New"/>
-                <w:b/>
-                <w:bCs/>
-              </w:rPr>
-              <w:t xml:space="preserve"> </w:t>
+              <w:t xml:space="preserve">2.8125 </w:t>
             </w:r>
             <w:r>
               <w:rPr>
@@ -3417,19 +3361,7 @@
               <w:rPr>
                 <w:rFonts w:ascii="Courier New" w:hAnsi="Courier New" w:cs="Courier New"/>
               </w:rPr>
-              <w:t xml:space="preserve">(L – 1) × </w:t>
-            </w:r>
-            <w:r>
-              <w:rPr>
-                <w:rFonts w:ascii="Courier New" w:hAnsi="Courier New" w:cs="Courier New"/>
-              </w:rPr>
-              <w:t>(</w:t>
-            </w:r>
-            <w:r>
-              <w:rPr>
-                <w:rFonts w:ascii="Courier New" w:hAnsi="Courier New" w:cs="Courier New"/>
-              </w:rPr>
-              <w:t>P</w:t>
+              <w:t>(L – 1) × (P</w:t>
             </w:r>
             <w:r>
               <w:rPr>
@@ -3559,25 +3491,7 @@
               <w:rPr>
                 <w:rFonts w:ascii="Courier New" w:hAnsi="Courier New" w:cs="Courier New"/>
               </w:rPr>
-              <w:t xml:space="preserve">(3 – 1) × </w:t>
-            </w:r>
-            <w:r>
-              <w:rPr>
-                <w:rFonts w:ascii="Courier New" w:hAnsi="Courier New" w:cs="Courier New"/>
-              </w:rPr>
-              <w:t>(</w:t>
-            </w:r>
-            <w:r>
-              <w:rPr>
-                <w:rFonts w:ascii="Courier New" w:hAnsi="Courier New" w:cs="Courier New"/>
-              </w:rPr>
-              <w:t>0.375</w:t>
-            </w:r>
-            <w:r>
-              <w:rPr>
-                <w:rFonts w:ascii="Courier New" w:hAnsi="Courier New" w:cs="Courier New"/>
-              </w:rPr>
-              <w:t xml:space="preserve"> + 0.3125 + 0.25 + 0.0625)</w:t>
+              <w:t>(3 – 1) × (0.375 + 0.3125 + 0.25 + 0.0625)</w:t>
             </w:r>
           </w:p>
         </w:tc>
@@ -5354,7 +5268,7 @@
       <w:tr>
         <w:tc>
           <w:tcPr>
-            <w:tcW w:w="4508" w:type="dxa"/>
+            <w:tcW w:w="4369" w:type="dxa"/>
             <w:vAlign w:val="center"/>
           </w:tcPr>
           <w:p>
@@ -5377,14 +5291,96 @@
                 <w:shd w:val="clear" w:color="auto" w:fill="FF6600"/>
               </w:rPr>
               <w:drawing>
-                <wp:inline distT="0" distB="0" distL="0" distR="0" wp14:anchorId="665B0090" wp14:editId="4C318814">
+                <wp:inline distT="0" distB="0" distL="0" distR="0" wp14:anchorId="4D62C975" wp14:editId="11931FE9">
+                  <wp:extent cx="2514600" cy="2152650"/>
+                  <wp:effectExtent l="0" t="0" r="0" b="0"/>
+                  <wp:docPr id="105372749" name="Chart 1"/>
+                  <wp:cNvGraphicFramePr/>
+                  <a:graphic xmlns:a="http://schemas.openxmlformats.org/drawingml/2006/main">
+                    <a:graphicData uri="http://schemas.openxmlformats.org/drawingml/2006/chart">
+                      <c:chart xmlns:c="http://schemas.openxmlformats.org/drawingml/2006/chart" xmlns:r="http://schemas.openxmlformats.org/officeDocument/2006/relationships" r:id="rId9"/>
+                    </a:graphicData>
+                  </a:graphic>
+                </wp:inline>
+              </w:drawing>
+            </w:r>
+          </w:p>
+        </w:tc>
+        <w:tc>
+          <w:tcPr>
+            <w:tcW w:w="4373" w:type="dxa"/>
+            <w:vAlign w:val="center"/>
+          </w:tcPr>
+          <w:p>
+            <w:pPr>
+              <w:pStyle w:val="ListParagraph"/>
+              <w:tabs>
+                <w:tab w:val="left" w:pos="1276"/>
+              </w:tabs>
+              <w:ind w:left="0"/>
+              <w:jc w:val="right"/>
+              <w:rPr>
+                <w:rFonts w:cs="Times New Roman"/>
+                <w:shd w:val="clear" w:color="auto" w:fill="FF6600"/>
+              </w:rPr>
+            </w:pPr>
+            <w:r>
+              <w:rPr>
+                <w:rFonts w:cs="Times New Roman"/>
+                <w:noProof/>
+                <w:shd w:val="clear" w:color="auto" w:fill="FF6600"/>
+              </w:rPr>
+              <w:drawing>
+                <wp:inline distT="0" distB="0" distL="0" distR="0" wp14:anchorId="21CC53D0" wp14:editId="6044944C">
+                  <wp:extent cx="2514600" cy="2152650"/>
+                  <wp:effectExtent l="0" t="0" r="0" b="0"/>
+                  <wp:docPr id="1507935708" name="Chart 1"/>
+                  <wp:cNvGraphicFramePr/>
+                  <a:graphic xmlns:a="http://schemas.openxmlformats.org/drawingml/2006/main">
+                    <a:graphicData uri="http://schemas.openxmlformats.org/drawingml/2006/chart">
+                      <c:chart xmlns:c="http://schemas.openxmlformats.org/drawingml/2006/chart" xmlns:r="http://schemas.openxmlformats.org/officeDocument/2006/relationships" r:id="rId10"/>
+                    </a:graphicData>
+                  </a:graphic>
+                </wp:inline>
+              </w:drawing>
+            </w:r>
+          </w:p>
+        </w:tc>
+      </w:tr>
+      <w:tr>
+        <w:tc>
+          <w:tcPr>
+            <w:tcW w:w="4369" w:type="dxa"/>
+            <w:vAlign w:val="center"/>
+          </w:tcPr>
+          <w:p>
+            <w:pPr>
+              <w:pStyle w:val="ListParagraph"/>
+              <w:tabs>
+                <w:tab w:val="left" w:pos="1276"/>
+              </w:tabs>
+              <w:ind w:left="0"/>
+              <w:jc w:val="left"/>
+              <w:rPr>
+                <w:rFonts w:cs="Times New Roman"/>
+                <w:shd w:val="clear" w:color="auto" w:fill="FF6600"/>
+              </w:rPr>
+            </w:pPr>
+            <w:r>
+              <w:rPr>
+                <w:rFonts w:cs="Times New Roman"/>
+                <w:noProof/>
+                <w:shd w:val="clear" w:color="auto" w:fill="FF6600"/>
+              </w:rPr>
+              <w:drawing>
+                <wp:inline distT="0" distB="0" distL="0" distR="0" wp14:anchorId="665B0090" wp14:editId="34874E1D">
                   <wp:extent cx="2514600" cy="2152650"/>
                   <wp:effectExtent l="0" t="0" r="0" b="0"/>
                   <wp:docPr id="1617737985" name="Chart 1"/>
                   <wp:cNvGraphicFramePr/>
                   <a:graphic xmlns:a="http://schemas.openxmlformats.org/drawingml/2006/main">
                     <a:graphicData uri="http://schemas.openxmlformats.org/drawingml/2006/chart">
-                      <c:chart xmlns:c="http://schemas.openxmlformats.org/drawingml/2006/chart" xmlns:r="http://schemas.openxmlformats.org/officeDocument/2006/relationships" r:id="rId7"/>
+                      <c:chart xmlns:c="http://schemas.openxmlformats.org/drawingml/2006/chart" xmlns:r="http://schemas.openxmlformats.org/officeDocument/2006/relationships" r:id="rId11"/>
                     </a:graphicData>
                   </a:graphic>
                 </wp:inline>
@@ -5394,7 +5390,7 @@
         </w:tc>
         <w:tc>
           <w:tcPr>
-            <w:tcW w:w="4508" w:type="dxa"/>
+            <w:tcW w:w="4373" w:type="dxa"/>
             <w:vAlign w:val="center"/>
           </w:tcPr>
           <w:p>
@@ -5417,14 +5413,14 @@
                 <w:shd w:val="clear" w:color="auto" w:fill="FF6600"/>
               </w:rPr>
               <w:drawing>
-                <wp:inline distT="0" distB="0" distL="0" distR="0" wp14:anchorId="6C5B03C9" wp14:editId="336360BC">
+                <wp:inline distT="0" distB="0" distL="0" distR="0" wp14:anchorId="6C5B03C9" wp14:editId="3883A8B9">
                   <wp:extent cx="2514600" cy="2152650"/>
-                  <wp:effectExtent l="0" t="0" r="9525" b="0"/>
+                  <wp:effectExtent l="0" t="0" r="0" b="0"/>
                   <wp:docPr id="1580720989" name="Chart 1"/>
                   <wp:cNvGraphicFramePr/>
                   <a:graphic xmlns:a="http://schemas.openxmlformats.org/drawingml/2006/main">
                     <a:graphicData uri="http://schemas.openxmlformats.org/drawingml/2006/chart">
-                      <c:chart xmlns:c="http://schemas.openxmlformats.org/drawingml/2006/chart" xmlns:r="http://schemas.openxmlformats.org/officeDocument/2006/relationships" r:id="rId8"/>
+                      <c:chart xmlns:c="http://schemas.openxmlformats.org/drawingml/2006/chart" xmlns:r="http://schemas.openxmlformats.org/officeDocument/2006/relationships" r:id="rId12"/>
                     </a:graphicData>
                   </a:graphic>
                 </wp:inline>
@@ -5500,7 +5496,7 @@
           <w:shd w:val="clear" w:color="auto" w:fill="FF6600"/>
         </w:rPr>
       </w:pPr>
-      <w:hyperlink r:id="rId9" w:history="1">
+      <w:hyperlink r:id="rId13" w:history="1">
         <w:r>
           <w:rPr>
             <w:rStyle w:val="Hyperlink"/>
@@ -5520,6 +5516,56 @@
     </w:sectPr>
   </w:body>
 </w:document>
+</file>
+
+<file path=word/endnotes.xml><?xml version="1.0" encoding="utf-8"?>
+<w:endnotes xmlns:wpc="http://schemas.microsoft.com/office/word/2010/wordprocessingCanvas" xmlns:cx="http://schemas.microsoft.com/office/drawing/2014/chartex" xmlns:cx1="http://schemas.microsoft.com/office/drawing/2015/9/8/chartex" xmlns:cx2="http://schemas.microsoft.com/office/drawing/2015/10/21/chartex" xmlns:cx3="http://schemas.microsoft.com/office/drawing/2016/5/9/chartex" xmlns:cx4="http://schemas.microsoft.com/office/drawing/2016/5/10/chartex" xmlns:cx5="http://schemas.microsoft.com/office/drawing/2016/5/11/chartex" xmlns:cx6="http://schemas.microsoft.com/office/drawing/2016/5/12/chartex" xmlns:cx7="http://schemas.microsoft.com/office/drawing/2016/5/13/chartex" xmlns:cx8="http://schemas.microsoft.com/office/drawing/2016/5/14/chartex" xmlns:mc="http://schemas.openxmlformats.org/markup-compatibility/2006" xmlns:aink="http://schemas.microsoft.com/office/drawing/2016/ink" xmlns:am3d="http://schemas.microsoft.com/office/drawing/2017/model3d" xmlns:o="urn:schemas-microsoft-com:office:office" xmlns:oel="http://schemas.microsoft.com/office/2019/extlst" xmlns:r="http://schemas.openxmlformats.org/officeDocument/2006/relationships" xmlns:m="http://schemas.openxmlformats.org/officeDocument/2006/math" xmlns:v="urn:schemas-microsoft-com:vml" xmlns:wp14="http://schemas.microsoft.com/office/word/2010/wordprocessingDrawing" xmlns:wp="http://schemas.openxmlformats.org/drawingml/2006/wordprocessingDrawing" xmlns:w10="urn:schemas-microsoft-com:office:word" xmlns:w="http://schemas.openxmlformats.org/wordprocessingml/2006/main" xmlns:w14="http://schemas.microsoft.com/office/word/2010/wordml" xmlns:w15="http://schemas.microsoft.com/office/word/2012/wordml" xmlns:w16cex="http://schemas.microsoft.com/office/word/2018/wordml/cex" xmlns:w16cid="http://schemas.microsoft.com/office/word/2016/wordml/cid" xmlns:w16="http://schemas.microsoft.com/office/word/2018/wordml" xmlns:w16du="http://schemas.microsoft.com/office/word/2023/wordml/word16du" xmlns:w16sdtdh="http://schemas.microsoft.com/office/word/2020/wordml/sdtdatahash" xmlns:w16se="http://schemas.microsoft.com/office/word/2015/wordml/symex" xmlns:wpg="http://schemas.microsoft.com/office/word/2010/wordprocessingGroup" xmlns:wpi="http://schemas.microsoft.com/office/word/2010/wordprocessingInk" xmlns:wne="http://schemas.microsoft.com/office/word/2006/wordml" xmlns:wps="http://schemas.microsoft.com/office/word/2010/wordprocessingShape" mc:Ignorable="w14 w15 w16se w16cid w16 w16cex w16sdtdh w16du wp14">
+  <w:endnote w:type="separator" w:id="-1">
+    <w:p>
+      <w:pPr>
+        <w:spacing w:after="0" w:line="240" w:lineRule="auto"/>
+      </w:pPr>
+      <w:r>
+        <w:separator/>
+      </w:r>
+    </w:p>
+  </w:endnote>
+  <w:endnote w:type="continuationSeparator" w:id="0">
+    <w:p>
+      <w:pPr>
+        <w:spacing w:after="0" w:line="240" w:lineRule="auto"/>
+      </w:pPr>
+      <w:r>
+        <w:continuationSeparator/>
+      </w:r>
+    </w:p>
+  </w:endnote>
+</w:endnotes>
+</file>
+
+<file path=word/footnotes.xml><?xml version="1.0" encoding="utf-8"?>
+<w:footnotes xmlns:wpc="http://schemas.microsoft.com/office/word/2010/wordprocessingCanvas" xmlns:cx="http://schemas.microsoft.com/office/drawing/2014/chartex" xmlns:cx1="http://schemas.microsoft.com/office/drawing/2015/9/8/chartex" xmlns:cx2="http://schemas.microsoft.com/office/drawing/2015/10/21/chartex" xmlns:cx3="http://schemas.microsoft.com/office/drawing/2016/5/9/chartex" xmlns:cx4="http://schemas.microsoft.com/office/drawing/2016/5/10/chartex" xmlns:cx5="http://schemas.microsoft.com/office/drawing/2016/5/11/chartex" xmlns:cx6="http://schemas.microsoft.com/office/drawing/2016/5/12/chartex" xmlns:cx7="http://schemas.microsoft.com/office/drawing/2016/5/13/chartex" xmlns:cx8="http://schemas.microsoft.com/office/drawing/2016/5/14/chartex" xmlns:mc="http://schemas.openxmlformats.org/markup-compatibility/2006" xmlns:aink="http://schemas.microsoft.com/office/drawing/2016/ink" xmlns:am3d="http://schemas.microsoft.com/office/drawing/2017/model3d" xmlns:o="urn:schemas-microsoft-com:office:office" xmlns:oel="http://schemas.microsoft.com/office/2019/extlst" xmlns:r="http://schemas.openxmlformats.org/officeDocument/2006/relationships" xmlns:m="http://schemas.openxmlformats.org/officeDocument/2006/math" xmlns:v="urn:schemas-microsoft-com:vml" xmlns:wp14="http://schemas.microsoft.com/office/word/2010/wordprocessingDrawing" xmlns:wp="http://schemas.openxmlformats.org/drawingml/2006/wordprocessingDrawing" xmlns:w10="urn:schemas-microsoft-com:office:word" xmlns:w="http://schemas.openxmlformats.org/wordprocessingml/2006/main" xmlns:w14="http://schemas.microsoft.com/office/word/2010/wordml" xmlns:w15="http://schemas.microsoft.com/office/word/2012/wordml" xmlns:w16cex="http://schemas.microsoft.com/office/word/2018/wordml/cex" xmlns:w16cid="http://schemas.microsoft.com/office/word/2016/wordml/cid" xmlns:w16="http://schemas.microsoft.com/office/word/2018/wordml" xmlns:w16du="http://schemas.microsoft.com/office/word/2023/wordml/word16du" xmlns:w16sdtdh="http://schemas.microsoft.com/office/word/2020/wordml/sdtdatahash" xmlns:w16se="http://schemas.microsoft.com/office/word/2015/wordml/symex" xmlns:wpg="http://schemas.microsoft.com/office/word/2010/wordprocessingGroup" xmlns:wpi="http://schemas.microsoft.com/office/word/2010/wordprocessingInk" xmlns:wne="http://schemas.microsoft.com/office/word/2006/wordml" xmlns:wps="http://schemas.microsoft.com/office/word/2010/wordprocessingShape" mc:Ignorable="w14 w15 w16se w16cid w16 w16cex w16sdtdh w16du wp14">
+  <w:footnote w:type="separator" w:id="-1">
+    <w:p>
+      <w:pPr>
+        <w:spacing w:after="0" w:line="240" w:lineRule="auto"/>
+      </w:pPr>
+      <w:r>
+        <w:separator/>
+      </w:r>
+    </w:p>
+  </w:footnote>
+  <w:footnote w:type="continuationSeparator" w:id="0">
+    <w:p>
+      <w:pPr>
+        <w:spacing w:after="0" w:line="240" w:lineRule="auto"/>
+      </w:pPr>
+      <w:r>
+        <w:continuationSeparator/>
+      </w:r>
+    </w:p>
+  </w:footnote>
+</w:footnotes>
 </file>
 
 <file path=word/numbering.xml><?xml version="1.0" encoding="utf-8"?>
@@ -6115,6 +6161,7 @@
   <w:style w:type="character" w:default="1" w:styleId="DefaultParagraphFont">
     <w:name w:val="Default Paragraph Font"/>
     <w:uiPriority w:val="1"/>
+    <w:semiHidden/>
     <w:unhideWhenUsed/>
   </w:style>
   <w:style w:type="table" w:default="1" w:styleId="TableNormal">
@@ -6201,6 +6248,50 @@
       <w:color w:val="666666"/>
     </w:rPr>
   </w:style>
+  <w:style w:type="paragraph" w:styleId="Header">
+    <w:name w:val="header"/>
+    <w:basedOn w:val="Normal"/>
+    <w:link w:val="HeaderChar"/>
+    <w:uiPriority w:val="99"/>
+    <w:unhideWhenUsed/>
+    <w:rsid w:val="007442DD"/>
+    <w:pPr>
+      <w:tabs>
+        <w:tab w:val="center" w:pos="4513"/>
+        <w:tab w:val="right" w:pos="9026"/>
+      </w:tabs>
+      <w:spacing w:after="0" w:line="240" w:lineRule="auto"/>
+    </w:pPr>
+  </w:style>
+  <w:style w:type="character" w:customStyle="1" w:styleId="HeaderChar">
+    <w:name w:val="Header Char"/>
+    <w:basedOn w:val="DefaultParagraphFont"/>
+    <w:link w:val="Header"/>
+    <w:uiPriority w:val="99"/>
+    <w:rsid w:val="007442DD"/>
+  </w:style>
+  <w:style w:type="paragraph" w:styleId="Footer">
+    <w:name w:val="footer"/>
+    <w:basedOn w:val="Normal"/>
+    <w:link w:val="FooterChar"/>
+    <w:uiPriority w:val="99"/>
+    <w:unhideWhenUsed/>
+    <w:rsid w:val="007442DD"/>
+    <w:pPr>
+      <w:tabs>
+        <w:tab w:val="center" w:pos="4513"/>
+        <w:tab w:val="right" w:pos="9026"/>
+      </w:tabs>
+      <w:spacing w:after="0" w:line="240" w:lineRule="auto"/>
+    </w:pPr>
+  </w:style>
+  <w:style w:type="character" w:customStyle="1" w:styleId="FooterChar">
+    <w:name w:val="Footer Char"/>
+    <w:basedOn w:val="DefaultParagraphFont"/>
+    <w:link w:val="Footer"/>
+    <w:uiPriority w:val="99"/>
+    <w:rsid w:val="007442DD"/>
+  </w:style>
 </w:styles>
 </file>
 
@@ -6238,8 +6329,16 @@
               </a:defRPr>
             </a:pPr>
             <a:r>
-              <a:rPr lang="en-ID" sz="1200"/>
-              <a:t>Histogram Sebelum Equalisasi</a:t>
+              <a:rPr lang="en-ID" sz="1100"/>
+              <a:t>Histogram Freq Sebelum</a:t>
+            </a:r>
+            <a:r>
+              <a:rPr lang="en-ID" sz="1100" baseline="0"/>
+              <a:t> </a:t>
+            </a:r>
+            <a:r>
+              <a:rPr lang="en-ID" sz="1100"/>
+              <a:t>Equalisasi</a:t>
             </a:r>
           </a:p>
         </c:rich>
@@ -6289,7 +6388,7 @@
               <c:strCache>
                 <c:ptCount val="1"/>
                 <c:pt idx="0">
-                  <c:v>2</c:v>
+                  <c:v>0</c:v>
                 </c:pt>
               </c:strCache>
             </c:strRef>
@@ -6320,14 +6419,14 @@
                 <c:formatCode>General</c:formatCode>
                 <c:ptCount val="1"/>
                 <c:pt idx="0">
-                  <c:v>0.375</c:v>
+                  <c:v>0</c:v>
                 </c:pt>
               </c:numCache>
             </c:numRef>
           </c:val>
           <c:extLst>
             <c:ext xmlns:c16="http://schemas.microsoft.com/office/drawing/2014/chart" uri="{C3380CC4-5D6E-409C-BE32-E72D297353CC}">
-              <c16:uniqueId val="{00000000-2614-4291-8E06-3926F2455581}"/>
+              <c16:uniqueId val="{00000000-6C0D-48BA-851D-EB64D0D65362}"/>
             </c:ext>
           </c:extLst>
         </c:ser>
@@ -6340,7 +6439,7 @@
               <c:strCache>
                 <c:ptCount val="1"/>
                 <c:pt idx="0">
-                  <c:v>3</c:v>
+                  <c:v>1</c:v>
                 </c:pt>
               </c:strCache>
             </c:strRef>
@@ -6371,14 +6470,14 @@
                 <c:formatCode>General</c:formatCode>
                 <c:ptCount val="1"/>
                 <c:pt idx="0">
-                  <c:v>0.3125</c:v>
+                  <c:v>0</c:v>
                 </c:pt>
               </c:numCache>
             </c:numRef>
           </c:val>
           <c:extLst>
             <c:ext xmlns:c16="http://schemas.microsoft.com/office/drawing/2014/chart" uri="{C3380CC4-5D6E-409C-BE32-E72D297353CC}">
-              <c16:uniqueId val="{00000001-2614-4291-8E06-3926F2455581}"/>
+              <c16:uniqueId val="{00000001-6C0D-48BA-851D-EB64D0D65362}"/>
             </c:ext>
           </c:extLst>
         </c:ser>
@@ -6391,7 +6490,7 @@
               <c:strCache>
                 <c:ptCount val="1"/>
                 <c:pt idx="0">
-                  <c:v>4</c:v>
+                  <c:v>2</c:v>
                 </c:pt>
               </c:strCache>
             </c:strRef>
@@ -6422,14 +6521,14 @@
                 <c:formatCode>General</c:formatCode>
                 <c:ptCount val="1"/>
                 <c:pt idx="0">
-                  <c:v>0.25</c:v>
+                  <c:v>6</c:v>
                 </c:pt>
               </c:numCache>
             </c:numRef>
           </c:val>
           <c:extLst>
             <c:ext xmlns:c16="http://schemas.microsoft.com/office/drawing/2014/chart" uri="{C3380CC4-5D6E-409C-BE32-E72D297353CC}">
-              <c16:uniqueId val="{00000002-2614-4291-8E06-3926F2455581}"/>
+              <c16:uniqueId val="{00000002-6C0D-48BA-851D-EB64D0D65362}"/>
             </c:ext>
           </c:extLst>
         </c:ser>
@@ -6442,7 +6541,7 @@
               <c:strCache>
                 <c:ptCount val="1"/>
                 <c:pt idx="0">
-                  <c:v>5</c:v>
+                  <c:v>3</c:v>
                 </c:pt>
               </c:strCache>
             </c:strRef>
@@ -6473,14 +6572,222 @@
                 <c:formatCode>General</c:formatCode>
                 <c:ptCount val="1"/>
                 <c:pt idx="0">
-                  <c:v>6.25E-2</c:v>
+                  <c:v>5</c:v>
                 </c:pt>
               </c:numCache>
             </c:numRef>
           </c:val>
           <c:extLst>
             <c:ext xmlns:c16="http://schemas.microsoft.com/office/drawing/2014/chart" uri="{C3380CC4-5D6E-409C-BE32-E72D297353CC}">
-              <c16:uniqueId val="{00000003-2614-4291-8E06-3926F2455581}"/>
+              <c16:uniqueId val="{00000003-6C0D-48BA-851D-EB64D0D65362}"/>
+            </c:ext>
+          </c:extLst>
+        </c:ser>
+        <c:ser>
+          <c:idx val="4"/>
+          <c:order val="4"/>
+          <c:tx>
+            <c:strRef>
+              <c:f>Sheet1!$F$1</c:f>
+              <c:strCache>
+                <c:ptCount val="1"/>
+                <c:pt idx="0">
+                  <c:v>4</c:v>
+                </c:pt>
+              </c:strCache>
+            </c:strRef>
+          </c:tx>
+          <c:spPr>
+            <a:solidFill>
+              <a:schemeClr val="accent5"/>
+            </a:solidFill>
+            <a:ln>
+              <a:noFill/>
+            </a:ln>
+            <a:effectLst/>
+          </c:spPr>
+          <c:invertIfNegative val="0"/>
+          <c:cat>
+            <c:numRef>
+              <c:f>Sheet1!$A$2</c:f>
+              <c:numCache>
+                <c:formatCode>General</c:formatCode>
+                <c:ptCount val="1"/>
+              </c:numCache>
+            </c:numRef>
+          </c:cat>
+          <c:val>
+            <c:numRef>
+              <c:f>Sheet1!$F$2</c:f>
+              <c:numCache>
+                <c:formatCode>General</c:formatCode>
+                <c:ptCount val="1"/>
+                <c:pt idx="0">
+                  <c:v>4</c:v>
+                </c:pt>
+              </c:numCache>
+            </c:numRef>
+          </c:val>
+          <c:extLst>
+            <c:ext xmlns:c16="http://schemas.microsoft.com/office/drawing/2014/chart" uri="{C3380CC4-5D6E-409C-BE32-E72D297353CC}">
+              <c16:uniqueId val="{00000004-6C0D-48BA-851D-EB64D0D65362}"/>
+            </c:ext>
+          </c:extLst>
+        </c:ser>
+        <c:ser>
+          <c:idx val="5"/>
+          <c:order val="5"/>
+          <c:tx>
+            <c:strRef>
+              <c:f>Sheet1!$G$1</c:f>
+              <c:strCache>
+                <c:ptCount val="1"/>
+                <c:pt idx="0">
+                  <c:v>5</c:v>
+                </c:pt>
+              </c:strCache>
+            </c:strRef>
+          </c:tx>
+          <c:spPr>
+            <a:solidFill>
+              <a:schemeClr val="accent6"/>
+            </a:solidFill>
+            <a:ln>
+              <a:noFill/>
+            </a:ln>
+            <a:effectLst/>
+          </c:spPr>
+          <c:invertIfNegative val="0"/>
+          <c:cat>
+            <c:numRef>
+              <c:f>Sheet1!$A$2</c:f>
+              <c:numCache>
+                <c:formatCode>General</c:formatCode>
+                <c:ptCount val="1"/>
+              </c:numCache>
+            </c:numRef>
+          </c:cat>
+          <c:val>
+            <c:numRef>
+              <c:f>Sheet1!$G$2</c:f>
+              <c:numCache>
+                <c:formatCode>General</c:formatCode>
+                <c:ptCount val="1"/>
+                <c:pt idx="0">
+                  <c:v>1</c:v>
+                </c:pt>
+              </c:numCache>
+            </c:numRef>
+          </c:val>
+          <c:extLst>
+            <c:ext xmlns:c16="http://schemas.microsoft.com/office/drawing/2014/chart" uri="{C3380CC4-5D6E-409C-BE32-E72D297353CC}">
+              <c16:uniqueId val="{00000005-6C0D-48BA-851D-EB64D0D65362}"/>
+            </c:ext>
+          </c:extLst>
+        </c:ser>
+        <c:ser>
+          <c:idx val="6"/>
+          <c:order val="6"/>
+          <c:tx>
+            <c:strRef>
+              <c:f>Sheet1!$H$1</c:f>
+              <c:strCache>
+                <c:ptCount val="1"/>
+                <c:pt idx="0">
+                  <c:v>6</c:v>
+                </c:pt>
+              </c:strCache>
+            </c:strRef>
+          </c:tx>
+          <c:spPr>
+            <a:solidFill>
+              <a:schemeClr val="accent1">
+                <a:lumMod val="60000"/>
+              </a:schemeClr>
+            </a:solidFill>
+            <a:ln>
+              <a:noFill/>
+            </a:ln>
+            <a:effectLst/>
+          </c:spPr>
+          <c:invertIfNegative val="0"/>
+          <c:cat>
+            <c:numRef>
+              <c:f>Sheet1!$A$2</c:f>
+              <c:numCache>
+                <c:formatCode>General</c:formatCode>
+                <c:ptCount val="1"/>
+              </c:numCache>
+            </c:numRef>
+          </c:cat>
+          <c:val>
+            <c:numRef>
+              <c:f>Sheet1!$H$2</c:f>
+              <c:numCache>
+                <c:formatCode>General</c:formatCode>
+                <c:ptCount val="1"/>
+                <c:pt idx="0">
+                  <c:v>0</c:v>
+                </c:pt>
+              </c:numCache>
+            </c:numRef>
+          </c:val>
+          <c:extLst>
+            <c:ext xmlns:c16="http://schemas.microsoft.com/office/drawing/2014/chart" uri="{C3380CC4-5D6E-409C-BE32-E72D297353CC}">
+              <c16:uniqueId val="{00000006-6C0D-48BA-851D-EB64D0D65362}"/>
+            </c:ext>
+          </c:extLst>
+        </c:ser>
+        <c:ser>
+          <c:idx val="7"/>
+          <c:order val="7"/>
+          <c:tx>
+            <c:strRef>
+              <c:f>Sheet1!$I$1</c:f>
+              <c:strCache>
+                <c:ptCount val="1"/>
+                <c:pt idx="0">
+                  <c:v>7</c:v>
+                </c:pt>
+              </c:strCache>
+            </c:strRef>
+          </c:tx>
+          <c:spPr>
+            <a:solidFill>
+              <a:schemeClr val="accent2">
+                <a:lumMod val="60000"/>
+              </a:schemeClr>
+            </a:solidFill>
+            <a:ln>
+              <a:noFill/>
+            </a:ln>
+            <a:effectLst/>
+          </c:spPr>
+          <c:invertIfNegative val="0"/>
+          <c:cat>
+            <c:numRef>
+              <c:f>Sheet1!$A$2</c:f>
+              <c:numCache>
+                <c:formatCode>General</c:formatCode>
+                <c:ptCount val="1"/>
+              </c:numCache>
+            </c:numRef>
+          </c:cat>
+          <c:val>
+            <c:numRef>
+              <c:f>Sheet1!$I$2</c:f>
+              <c:numCache>
+                <c:formatCode>General</c:formatCode>
+                <c:ptCount val="1"/>
+                <c:pt idx="0">
+                  <c:v>0</c:v>
+                </c:pt>
+              </c:numCache>
+            </c:numRef>
+          </c:val>
+          <c:extLst>
+            <c:ext xmlns:c16="http://schemas.microsoft.com/office/drawing/2014/chart" uri="{C3380CC4-5D6E-409C-BE32-E72D297353CC}">
+              <c16:uniqueId val="{00000007-6C0D-48BA-851D-EB64D0D65362}"/>
             </c:ext>
           </c:extLst>
         </c:ser>
@@ -6719,8 +7026,8 @@
               </a:defRPr>
             </a:pPr>
             <a:r>
-              <a:rPr lang="en-ID" sz="1200"/>
-              <a:t>Histogram Setelah Equalisasi</a:t>
+              <a:rPr lang="en-ID" sz="1100"/>
+              <a:t>Histogram Freq Setelah Equalisasi</a:t>
             </a:r>
           </a:p>
         </c:rich>
@@ -6770,7 +7077,7 @@
               <c:strCache>
                 <c:ptCount val="1"/>
                 <c:pt idx="0">
-                  <c:v>1</c:v>
+                  <c:v>0</c:v>
                 </c:pt>
               </c:strCache>
             </c:strRef>
@@ -6801,14 +7108,14 @@
                 <c:formatCode>General</c:formatCode>
                 <c:ptCount val="1"/>
                 <c:pt idx="0">
-                  <c:v>0.375</c:v>
+                  <c:v>0</c:v>
                 </c:pt>
               </c:numCache>
             </c:numRef>
           </c:val>
           <c:extLst>
             <c:ext xmlns:c16="http://schemas.microsoft.com/office/drawing/2014/chart" uri="{C3380CC4-5D6E-409C-BE32-E72D297353CC}">
-              <c16:uniqueId val="{00000000-8971-4D28-9A18-B341CFC52CB6}"/>
+              <c16:uniqueId val="{00000000-27F5-44BE-ACC7-194B1C9E7E27}"/>
             </c:ext>
           </c:extLst>
         </c:ser>
@@ -6821,7 +7128,7 @@
               <c:strCache>
                 <c:ptCount val="1"/>
                 <c:pt idx="0">
-                  <c:v>2</c:v>
+                  <c:v>1</c:v>
                 </c:pt>
               </c:strCache>
             </c:strRef>
@@ -6852,7 +7159,1385 @@
                 <c:formatCode>General</c:formatCode>
                 <c:ptCount val="1"/>
                 <c:pt idx="0">
+                  <c:v>6</c:v>
+                </c:pt>
+              </c:numCache>
+            </c:numRef>
+          </c:val>
+          <c:extLst>
+            <c:ext xmlns:c16="http://schemas.microsoft.com/office/drawing/2014/chart" uri="{C3380CC4-5D6E-409C-BE32-E72D297353CC}">
+              <c16:uniqueId val="{00000001-27F5-44BE-ACC7-194B1C9E7E27}"/>
+            </c:ext>
+          </c:extLst>
+        </c:ser>
+        <c:ser>
+          <c:idx val="2"/>
+          <c:order val="2"/>
+          <c:tx>
+            <c:strRef>
+              <c:f>Sheet1!$D$1</c:f>
+              <c:strCache>
+                <c:ptCount val="1"/>
+                <c:pt idx="0">
+                  <c:v>2</c:v>
+                </c:pt>
+              </c:strCache>
+            </c:strRef>
+          </c:tx>
+          <c:spPr>
+            <a:solidFill>
+              <a:schemeClr val="accent3"/>
+            </a:solidFill>
+            <a:ln>
+              <a:noFill/>
+            </a:ln>
+            <a:effectLst/>
+          </c:spPr>
+          <c:invertIfNegative val="0"/>
+          <c:cat>
+            <c:numRef>
+              <c:f>Sheet1!$A$2</c:f>
+              <c:numCache>
+                <c:formatCode>General</c:formatCode>
+                <c:ptCount val="1"/>
+              </c:numCache>
+            </c:numRef>
+          </c:cat>
+          <c:val>
+            <c:numRef>
+              <c:f>Sheet1!$D$2</c:f>
+              <c:numCache>
+                <c:formatCode>General</c:formatCode>
+                <c:ptCount val="1"/>
+                <c:pt idx="0">
+                  <c:v>5</c:v>
+                </c:pt>
+              </c:numCache>
+            </c:numRef>
+          </c:val>
+          <c:extLst>
+            <c:ext xmlns:c16="http://schemas.microsoft.com/office/drawing/2014/chart" uri="{C3380CC4-5D6E-409C-BE32-E72D297353CC}">
+              <c16:uniqueId val="{00000002-27F5-44BE-ACC7-194B1C9E7E27}"/>
+            </c:ext>
+          </c:extLst>
+        </c:ser>
+        <c:ser>
+          <c:idx val="3"/>
+          <c:order val="3"/>
+          <c:tx>
+            <c:strRef>
+              <c:f>Sheet1!$E$1</c:f>
+              <c:strCache>
+                <c:ptCount val="1"/>
+                <c:pt idx="0">
+                  <c:v>3</c:v>
+                </c:pt>
+              </c:strCache>
+            </c:strRef>
+          </c:tx>
+          <c:spPr>
+            <a:solidFill>
+              <a:schemeClr val="accent4"/>
+            </a:solidFill>
+            <a:ln>
+              <a:noFill/>
+            </a:ln>
+            <a:effectLst/>
+          </c:spPr>
+          <c:invertIfNegative val="0"/>
+          <c:cat>
+            <c:numRef>
+              <c:f>Sheet1!$A$2</c:f>
+              <c:numCache>
+                <c:formatCode>General</c:formatCode>
+                <c:ptCount val="1"/>
+              </c:numCache>
+            </c:numRef>
+          </c:cat>
+          <c:val>
+            <c:numRef>
+              <c:f>Sheet1!$E$2</c:f>
+              <c:numCache>
+                <c:formatCode>General</c:formatCode>
+                <c:ptCount val="1"/>
+                <c:pt idx="0">
+                  <c:v>5</c:v>
+                </c:pt>
+              </c:numCache>
+            </c:numRef>
+          </c:val>
+          <c:extLst>
+            <c:ext xmlns:c16="http://schemas.microsoft.com/office/drawing/2014/chart" uri="{C3380CC4-5D6E-409C-BE32-E72D297353CC}">
+              <c16:uniqueId val="{00000003-27F5-44BE-ACC7-194B1C9E7E27}"/>
+            </c:ext>
+          </c:extLst>
+        </c:ser>
+        <c:ser>
+          <c:idx val="4"/>
+          <c:order val="4"/>
+          <c:tx>
+            <c:strRef>
+              <c:f>Sheet1!$F$1</c:f>
+              <c:strCache>
+                <c:ptCount val="1"/>
+                <c:pt idx="0">
+                  <c:v>4</c:v>
+                </c:pt>
+              </c:strCache>
+            </c:strRef>
+          </c:tx>
+          <c:spPr>
+            <a:solidFill>
+              <a:schemeClr val="accent5"/>
+            </a:solidFill>
+            <a:ln>
+              <a:noFill/>
+            </a:ln>
+            <a:effectLst/>
+          </c:spPr>
+          <c:invertIfNegative val="0"/>
+          <c:cat>
+            <c:numRef>
+              <c:f>Sheet1!$A$2</c:f>
+              <c:numCache>
+                <c:formatCode>General</c:formatCode>
+                <c:ptCount val="1"/>
+              </c:numCache>
+            </c:numRef>
+          </c:cat>
+          <c:val>
+            <c:numRef>
+              <c:f>Sheet1!$F$2</c:f>
+              <c:numCache>
+                <c:formatCode>General</c:formatCode>
+                <c:ptCount val="1"/>
+                <c:pt idx="0">
+                  <c:v>0</c:v>
+                </c:pt>
+              </c:numCache>
+            </c:numRef>
+          </c:val>
+          <c:extLst>
+            <c:ext xmlns:c16="http://schemas.microsoft.com/office/drawing/2014/chart" uri="{C3380CC4-5D6E-409C-BE32-E72D297353CC}">
+              <c16:uniqueId val="{00000004-27F5-44BE-ACC7-194B1C9E7E27}"/>
+            </c:ext>
+          </c:extLst>
+        </c:ser>
+        <c:ser>
+          <c:idx val="5"/>
+          <c:order val="5"/>
+          <c:tx>
+            <c:strRef>
+              <c:f>Sheet1!$G$1</c:f>
+              <c:strCache>
+                <c:ptCount val="1"/>
+                <c:pt idx="0">
+                  <c:v>5</c:v>
+                </c:pt>
+              </c:strCache>
+            </c:strRef>
+          </c:tx>
+          <c:spPr>
+            <a:solidFill>
+              <a:schemeClr val="accent6"/>
+            </a:solidFill>
+            <a:ln>
+              <a:noFill/>
+            </a:ln>
+            <a:effectLst/>
+          </c:spPr>
+          <c:invertIfNegative val="0"/>
+          <c:cat>
+            <c:numRef>
+              <c:f>Sheet1!$A$2</c:f>
+              <c:numCache>
+                <c:formatCode>General</c:formatCode>
+                <c:ptCount val="1"/>
+              </c:numCache>
+            </c:numRef>
+          </c:cat>
+          <c:val>
+            <c:numRef>
+              <c:f>Sheet1!$G$2</c:f>
+              <c:numCache>
+                <c:formatCode>General</c:formatCode>
+                <c:ptCount val="1"/>
+                <c:pt idx="0">
+                  <c:v>0</c:v>
+                </c:pt>
+              </c:numCache>
+            </c:numRef>
+          </c:val>
+          <c:extLst>
+            <c:ext xmlns:c16="http://schemas.microsoft.com/office/drawing/2014/chart" uri="{C3380CC4-5D6E-409C-BE32-E72D297353CC}">
+              <c16:uniqueId val="{00000005-27F5-44BE-ACC7-194B1C9E7E27}"/>
+            </c:ext>
+          </c:extLst>
+        </c:ser>
+        <c:ser>
+          <c:idx val="6"/>
+          <c:order val="6"/>
+          <c:tx>
+            <c:strRef>
+              <c:f>Sheet1!$H$1</c:f>
+              <c:strCache>
+                <c:ptCount val="1"/>
+                <c:pt idx="0">
+                  <c:v>6</c:v>
+                </c:pt>
+              </c:strCache>
+            </c:strRef>
+          </c:tx>
+          <c:spPr>
+            <a:solidFill>
+              <a:schemeClr val="accent1">
+                <a:lumMod val="60000"/>
+              </a:schemeClr>
+            </a:solidFill>
+            <a:ln>
+              <a:noFill/>
+            </a:ln>
+            <a:effectLst/>
+          </c:spPr>
+          <c:invertIfNegative val="0"/>
+          <c:cat>
+            <c:numRef>
+              <c:f>Sheet1!$A$2</c:f>
+              <c:numCache>
+                <c:formatCode>General</c:formatCode>
+                <c:ptCount val="1"/>
+              </c:numCache>
+            </c:numRef>
+          </c:cat>
+          <c:val>
+            <c:numRef>
+              <c:f>Sheet1!$H$2</c:f>
+              <c:numCache>
+                <c:formatCode>General</c:formatCode>
+                <c:ptCount val="1"/>
+                <c:pt idx="0">
+                  <c:v>0</c:v>
+                </c:pt>
+              </c:numCache>
+            </c:numRef>
+          </c:val>
+          <c:extLst>
+            <c:ext xmlns:c16="http://schemas.microsoft.com/office/drawing/2014/chart" uri="{C3380CC4-5D6E-409C-BE32-E72D297353CC}">
+              <c16:uniqueId val="{00000006-27F5-44BE-ACC7-194B1C9E7E27}"/>
+            </c:ext>
+          </c:extLst>
+        </c:ser>
+        <c:ser>
+          <c:idx val="7"/>
+          <c:order val="7"/>
+          <c:tx>
+            <c:strRef>
+              <c:f>Sheet1!$I$1</c:f>
+              <c:strCache>
+                <c:ptCount val="1"/>
+                <c:pt idx="0">
+                  <c:v>7</c:v>
+                </c:pt>
+              </c:strCache>
+            </c:strRef>
+          </c:tx>
+          <c:spPr>
+            <a:solidFill>
+              <a:schemeClr val="accent2">
+                <a:lumMod val="60000"/>
+              </a:schemeClr>
+            </a:solidFill>
+            <a:ln>
+              <a:noFill/>
+            </a:ln>
+            <a:effectLst/>
+          </c:spPr>
+          <c:invertIfNegative val="0"/>
+          <c:cat>
+            <c:numRef>
+              <c:f>Sheet1!$A$2</c:f>
+              <c:numCache>
+                <c:formatCode>General</c:formatCode>
+                <c:ptCount val="1"/>
+              </c:numCache>
+            </c:numRef>
+          </c:cat>
+          <c:val>
+            <c:numRef>
+              <c:f>Sheet1!$I$2</c:f>
+              <c:numCache>
+                <c:formatCode>General</c:formatCode>
+                <c:ptCount val="1"/>
+                <c:pt idx="0">
+                  <c:v>0</c:v>
+                </c:pt>
+              </c:numCache>
+            </c:numRef>
+          </c:val>
+          <c:extLst>
+            <c:ext xmlns:c16="http://schemas.microsoft.com/office/drawing/2014/chart" uri="{C3380CC4-5D6E-409C-BE32-E72D297353CC}">
+              <c16:uniqueId val="{00000007-27F5-44BE-ACC7-194B1C9E7E27}"/>
+            </c:ext>
+          </c:extLst>
+        </c:ser>
+        <c:dLbls>
+          <c:showLegendKey val="0"/>
+          <c:showVal val="0"/>
+          <c:showCatName val="0"/>
+          <c:showSerName val="0"/>
+          <c:showPercent val="0"/>
+          <c:showBubbleSize val="0"/>
+        </c:dLbls>
+        <c:gapWidth val="219"/>
+        <c:overlap val="-27"/>
+        <c:axId val="375177439"/>
+        <c:axId val="375187519"/>
+      </c:barChart>
+      <c:catAx>
+        <c:axId val="375177439"/>
+        <c:scaling>
+          <c:orientation val="minMax"/>
+        </c:scaling>
+        <c:delete val="0"/>
+        <c:axPos val="b"/>
+        <c:numFmt formatCode="General" sourceLinked="1"/>
+        <c:majorTickMark val="none"/>
+        <c:minorTickMark val="none"/>
+        <c:tickLblPos val="nextTo"/>
+        <c:spPr>
+          <a:noFill/>
+          <a:ln w="9525" cap="flat" cmpd="sng" algn="ctr">
+            <a:solidFill>
+              <a:schemeClr val="tx1">
+                <a:lumMod val="15000"/>
+                <a:lumOff val="85000"/>
+              </a:schemeClr>
+            </a:solidFill>
+            <a:round/>
+          </a:ln>
+          <a:effectLst/>
+        </c:spPr>
+        <c:txPr>
+          <a:bodyPr rot="-60000000" spcFirstLastPara="1" vertOverflow="ellipsis" vert="horz" wrap="square" anchor="ctr" anchorCtr="1"/>
+          <a:lstStyle/>
+          <a:p>
+            <a:pPr>
+              <a:defRPr sz="900" b="0" i="0" u="none" strike="noStrike" kern="1200" baseline="0">
+                <a:solidFill>
+                  <a:schemeClr val="tx1">
+                    <a:lumMod val="65000"/>
+                    <a:lumOff val="35000"/>
+                  </a:schemeClr>
+                </a:solidFill>
+                <a:latin typeface="+mn-lt"/>
+                <a:ea typeface="+mn-ea"/>
+                <a:cs typeface="+mn-cs"/>
+              </a:defRPr>
+            </a:pPr>
+            <a:endParaRPr lang="en-US"/>
+          </a:p>
+        </c:txPr>
+        <c:crossAx val="375187519"/>
+        <c:crosses val="autoZero"/>
+        <c:auto val="1"/>
+        <c:lblAlgn val="ctr"/>
+        <c:lblOffset val="100"/>
+        <c:noMultiLvlLbl val="0"/>
+      </c:catAx>
+      <c:valAx>
+        <c:axId val="375187519"/>
+        <c:scaling>
+          <c:orientation val="minMax"/>
+        </c:scaling>
+        <c:delete val="0"/>
+        <c:axPos val="l"/>
+        <c:majorGridlines>
+          <c:spPr>
+            <a:ln w="9525" cap="flat" cmpd="sng" algn="ctr">
+              <a:solidFill>
+                <a:schemeClr val="tx1">
+                  <a:lumMod val="15000"/>
+                  <a:lumOff val="85000"/>
+                </a:schemeClr>
+              </a:solidFill>
+              <a:round/>
+            </a:ln>
+            <a:effectLst/>
+          </c:spPr>
+        </c:majorGridlines>
+        <c:numFmt formatCode="General" sourceLinked="1"/>
+        <c:majorTickMark val="none"/>
+        <c:minorTickMark val="none"/>
+        <c:tickLblPos val="nextTo"/>
+        <c:spPr>
+          <a:noFill/>
+          <a:ln>
+            <a:noFill/>
+          </a:ln>
+          <a:effectLst/>
+        </c:spPr>
+        <c:txPr>
+          <a:bodyPr rot="-60000000" spcFirstLastPara="1" vertOverflow="ellipsis" vert="horz" wrap="square" anchor="ctr" anchorCtr="1"/>
+          <a:lstStyle/>
+          <a:p>
+            <a:pPr>
+              <a:defRPr sz="900" b="0" i="0" u="none" strike="noStrike" kern="1200" baseline="0">
+                <a:solidFill>
+                  <a:schemeClr val="tx1">
+                    <a:lumMod val="65000"/>
+                    <a:lumOff val="35000"/>
+                  </a:schemeClr>
+                </a:solidFill>
+                <a:latin typeface="+mn-lt"/>
+                <a:ea typeface="+mn-ea"/>
+                <a:cs typeface="+mn-cs"/>
+              </a:defRPr>
+            </a:pPr>
+            <a:endParaRPr lang="en-US"/>
+          </a:p>
+        </c:txPr>
+        <c:crossAx val="375177439"/>
+        <c:crosses val="autoZero"/>
+        <c:crossBetween val="between"/>
+      </c:valAx>
+      <c:spPr>
+        <a:noFill/>
+        <a:ln>
+          <a:noFill/>
+        </a:ln>
+        <a:effectLst/>
+      </c:spPr>
+    </c:plotArea>
+    <c:legend>
+      <c:legendPos val="b"/>
+      <c:overlay val="0"/>
+      <c:spPr>
+        <a:noFill/>
+        <a:ln>
+          <a:noFill/>
+        </a:ln>
+        <a:effectLst/>
+      </c:spPr>
+      <c:txPr>
+        <a:bodyPr rot="0" spcFirstLastPara="1" vertOverflow="ellipsis" vert="horz" wrap="square" anchor="ctr" anchorCtr="1"/>
+        <a:lstStyle/>
+        <a:p>
+          <a:pPr>
+            <a:defRPr sz="900" b="0" i="0" u="none" strike="noStrike" kern="1200" baseline="0">
+              <a:solidFill>
+                <a:schemeClr val="tx1">
+                  <a:lumMod val="65000"/>
+                  <a:lumOff val="35000"/>
+                </a:schemeClr>
+              </a:solidFill>
+              <a:latin typeface="+mn-lt"/>
+              <a:ea typeface="+mn-ea"/>
+              <a:cs typeface="+mn-cs"/>
+            </a:defRPr>
+          </a:pPr>
+          <a:endParaRPr lang="en-US"/>
+        </a:p>
+      </c:txPr>
+    </c:legend>
+    <c:plotVisOnly val="1"/>
+    <c:dispBlanksAs val="gap"/>
+    <c:extLst>
+      <c:ext xmlns:c16r3="http://schemas.microsoft.com/office/drawing/2017/03/chart" uri="{56B9EC1D-385E-4148-901F-78D8002777C0}">
+        <c16r3:dataDisplayOptions16>
+          <c16r3:dispNaAsBlank val="1"/>
+        </c16r3:dataDisplayOptions16>
+      </c:ext>
+    </c:extLst>
+    <c:showDLblsOverMax val="0"/>
+  </c:chart>
+  <c:spPr>
+    <a:solidFill>
+      <a:schemeClr val="bg1"/>
+    </a:solidFill>
+    <a:ln w="9525" cap="flat" cmpd="sng" algn="ctr">
+      <a:solidFill>
+        <a:schemeClr val="tx1">
+          <a:lumMod val="15000"/>
+          <a:lumOff val="85000"/>
+        </a:schemeClr>
+      </a:solidFill>
+      <a:round/>
+    </a:ln>
+    <a:effectLst/>
+  </c:spPr>
+  <c:txPr>
+    <a:bodyPr/>
+    <a:lstStyle/>
+    <a:p>
+      <a:pPr>
+        <a:defRPr/>
+      </a:pPr>
+      <a:endParaRPr lang="en-US"/>
+    </a:p>
+  </c:txPr>
+  <c:externalData r:id="rId3">
+    <c:autoUpdate val="0"/>
+  </c:externalData>
+</c:chartSpace>
+</file>
+
+<file path=word/charts/chart3.xml><?xml version="1.0" encoding="utf-8"?>
+<c:chartSpace xmlns:c="http://schemas.openxmlformats.org/drawingml/2006/chart" xmlns:a="http://schemas.openxmlformats.org/drawingml/2006/main" xmlns:r="http://schemas.openxmlformats.org/officeDocument/2006/relationships" xmlns:c16r2="http://schemas.microsoft.com/office/drawing/2015/06/chart">
+  <c:date1904 val="0"/>
+  <c:lang val="en-US"/>
+  <c:roundedCorners val="0"/>
+  <mc:AlternateContent xmlns:mc="http://schemas.openxmlformats.org/markup-compatibility/2006">
+    <mc:Choice xmlns:c14="http://schemas.microsoft.com/office/drawing/2007/8/2/chart" Requires="c14">
+      <c14:style val="102"/>
+    </mc:Choice>
+    <mc:Fallback>
+      <c:style val="2"/>
+    </mc:Fallback>
+  </mc:AlternateContent>
+  <c:chart>
+    <c:title>
+      <c:tx>
+        <c:rich>
+          <a:bodyPr rot="0" spcFirstLastPara="1" vertOverflow="ellipsis" vert="horz" wrap="square" anchor="ctr" anchorCtr="1"/>
+          <a:lstStyle/>
+          <a:p>
+            <a:pPr>
+              <a:defRPr sz="1400" b="0" i="0" u="none" strike="noStrike" kern="1200" spc="0" baseline="0">
+                <a:solidFill>
+                  <a:schemeClr val="tx1">
+                    <a:lumMod val="65000"/>
+                    <a:lumOff val="35000"/>
+                  </a:schemeClr>
+                </a:solidFill>
+                <a:latin typeface="+mn-lt"/>
+                <a:ea typeface="+mn-ea"/>
+                <a:cs typeface="+mn-cs"/>
+              </a:defRPr>
+            </a:pPr>
+            <a:r>
+              <a:rPr lang="en-ID" sz="1100"/>
+              <a:t>Histogram Probabilitas Sebelum Equalisasi</a:t>
+            </a:r>
+          </a:p>
+        </c:rich>
+      </c:tx>
+      <c:overlay val="0"/>
+      <c:spPr>
+        <a:noFill/>
+        <a:ln>
+          <a:noFill/>
+        </a:ln>
+        <a:effectLst/>
+      </c:spPr>
+      <c:txPr>
+        <a:bodyPr rot="0" spcFirstLastPara="1" vertOverflow="ellipsis" vert="horz" wrap="square" anchor="ctr" anchorCtr="1"/>
+        <a:lstStyle/>
+        <a:p>
+          <a:pPr>
+            <a:defRPr sz="1400" b="0" i="0" u="none" strike="noStrike" kern="1200" spc="0" baseline="0">
+              <a:solidFill>
+                <a:schemeClr val="tx1">
+                  <a:lumMod val="65000"/>
+                  <a:lumOff val="35000"/>
+                </a:schemeClr>
+              </a:solidFill>
+              <a:latin typeface="+mn-lt"/>
+              <a:ea typeface="+mn-ea"/>
+              <a:cs typeface="+mn-cs"/>
+            </a:defRPr>
+          </a:pPr>
+          <a:endParaRPr lang="en-US"/>
+        </a:p>
+      </c:txPr>
+    </c:title>
+    <c:autoTitleDeleted val="0"/>
+    <c:plotArea>
+      <c:layout/>
+      <c:barChart>
+        <c:barDir val="col"/>
+        <c:grouping val="clustered"/>
+        <c:varyColors val="0"/>
+        <c:ser>
+          <c:idx val="0"/>
+          <c:order val="0"/>
+          <c:tx>
+            <c:strRef>
+              <c:f>Sheet1!$B$1</c:f>
+              <c:strCache>
+                <c:ptCount val="1"/>
+                <c:pt idx="0">
+                  <c:v>0</c:v>
+                </c:pt>
+              </c:strCache>
+            </c:strRef>
+          </c:tx>
+          <c:spPr>
+            <a:solidFill>
+              <a:schemeClr val="accent1"/>
+            </a:solidFill>
+            <a:ln>
+              <a:noFill/>
+            </a:ln>
+            <a:effectLst/>
+          </c:spPr>
+          <c:invertIfNegative val="0"/>
+          <c:cat>
+            <c:numRef>
+              <c:f>Sheet1!$A$2</c:f>
+              <c:numCache>
+                <c:formatCode>General</c:formatCode>
+                <c:ptCount val="1"/>
+              </c:numCache>
+            </c:numRef>
+          </c:cat>
+          <c:val>
+            <c:numRef>
+              <c:f>Sheet1!$B$2</c:f>
+              <c:numCache>
+                <c:formatCode>General</c:formatCode>
+                <c:ptCount val="1"/>
+                <c:pt idx="0">
+                  <c:v>0</c:v>
+                </c:pt>
+              </c:numCache>
+            </c:numRef>
+          </c:val>
+          <c:extLst>
+            <c:ext xmlns:c16="http://schemas.microsoft.com/office/drawing/2014/chart" uri="{C3380CC4-5D6E-409C-BE32-E72D297353CC}">
+              <c16:uniqueId val="{00000000-2614-4291-8E06-3926F2455581}"/>
+            </c:ext>
+          </c:extLst>
+        </c:ser>
+        <c:ser>
+          <c:idx val="1"/>
+          <c:order val="1"/>
+          <c:tx>
+            <c:strRef>
+              <c:f>Sheet1!$C$1</c:f>
+              <c:strCache>
+                <c:ptCount val="1"/>
+                <c:pt idx="0">
+                  <c:v>1</c:v>
+                </c:pt>
+              </c:strCache>
+            </c:strRef>
+          </c:tx>
+          <c:spPr>
+            <a:solidFill>
+              <a:schemeClr val="accent2"/>
+            </a:solidFill>
+            <a:ln>
+              <a:noFill/>
+            </a:ln>
+            <a:effectLst/>
+          </c:spPr>
+          <c:invertIfNegative val="0"/>
+          <c:cat>
+            <c:numRef>
+              <c:f>Sheet1!$A$2</c:f>
+              <c:numCache>
+                <c:formatCode>General</c:formatCode>
+                <c:ptCount val="1"/>
+              </c:numCache>
+            </c:numRef>
+          </c:cat>
+          <c:val>
+            <c:numRef>
+              <c:f>Sheet1!$C$2</c:f>
+              <c:numCache>
+                <c:formatCode>General</c:formatCode>
+                <c:ptCount val="1"/>
+                <c:pt idx="0">
+                  <c:v>0</c:v>
+                </c:pt>
+              </c:numCache>
+            </c:numRef>
+          </c:val>
+          <c:extLst>
+            <c:ext xmlns:c16="http://schemas.microsoft.com/office/drawing/2014/chart" uri="{C3380CC4-5D6E-409C-BE32-E72D297353CC}">
+              <c16:uniqueId val="{00000001-2614-4291-8E06-3926F2455581}"/>
+            </c:ext>
+          </c:extLst>
+        </c:ser>
+        <c:ser>
+          <c:idx val="2"/>
+          <c:order val="2"/>
+          <c:tx>
+            <c:strRef>
+              <c:f>Sheet1!$D$1</c:f>
+              <c:strCache>
+                <c:ptCount val="1"/>
+                <c:pt idx="0">
+                  <c:v>2</c:v>
+                </c:pt>
+              </c:strCache>
+            </c:strRef>
+          </c:tx>
+          <c:spPr>
+            <a:solidFill>
+              <a:schemeClr val="accent3"/>
+            </a:solidFill>
+            <a:ln>
+              <a:noFill/>
+            </a:ln>
+            <a:effectLst/>
+          </c:spPr>
+          <c:invertIfNegative val="0"/>
+          <c:cat>
+            <c:numRef>
+              <c:f>Sheet1!$A$2</c:f>
+              <c:numCache>
+                <c:formatCode>General</c:formatCode>
+                <c:ptCount val="1"/>
+              </c:numCache>
+            </c:numRef>
+          </c:cat>
+          <c:val>
+            <c:numRef>
+              <c:f>Sheet1!$D$2</c:f>
+              <c:numCache>
+                <c:formatCode>General</c:formatCode>
+                <c:ptCount val="1"/>
+                <c:pt idx="0">
+                  <c:v>0.375</c:v>
+                </c:pt>
+              </c:numCache>
+            </c:numRef>
+          </c:val>
+          <c:extLst>
+            <c:ext xmlns:c16="http://schemas.microsoft.com/office/drawing/2014/chart" uri="{C3380CC4-5D6E-409C-BE32-E72D297353CC}">
+              <c16:uniqueId val="{00000002-2614-4291-8E06-3926F2455581}"/>
+            </c:ext>
+          </c:extLst>
+        </c:ser>
+        <c:ser>
+          <c:idx val="3"/>
+          <c:order val="3"/>
+          <c:tx>
+            <c:strRef>
+              <c:f>Sheet1!$E$1</c:f>
+              <c:strCache>
+                <c:ptCount val="1"/>
+                <c:pt idx="0">
+                  <c:v>3</c:v>
+                </c:pt>
+              </c:strCache>
+            </c:strRef>
+          </c:tx>
+          <c:spPr>
+            <a:solidFill>
+              <a:schemeClr val="accent4"/>
+            </a:solidFill>
+            <a:ln>
+              <a:noFill/>
+            </a:ln>
+            <a:effectLst/>
+          </c:spPr>
+          <c:invertIfNegative val="0"/>
+          <c:cat>
+            <c:numRef>
+              <c:f>Sheet1!$A$2</c:f>
+              <c:numCache>
+                <c:formatCode>General</c:formatCode>
+                <c:ptCount val="1"/>
+              </c:numCache>
+            </c:numRef>
+          </c:cat>
+          <c:val>
+            <c:numRef>
+              <c:f>Sheet1!$E$2</c:f>
+              <c:numCache>
+                <c:formatCode>General</c:formatCode>
+                <c:ptCount val="1"/>
+                <c:pt idx="0">
                   <c:v>0.3125</c:v>
+                </c:pt>
+              </c:numCache>
+            </c:numRef>
+          </c:val>
+          <c:extLst>
+            <c:ext xmlns:c16="http://schemas.microsoft.com/office/drawing/2014/chart" uri="{C3380CC4-5D6E-409C-BE32-E72D297353CC}">
+              <c16:uniqueId val="{00000003-2614-4291-8E06-3926F2455581}"/>
+            </c:ext>
+          </c:extLst>
+        </c:ser>
+        <c:ser>
+          <c:idx val="4"/>
+          <c:order val="4"/>
+          <c:tx>
+            <c:strRef>
+              <c:f>Sheet1!$F$1</c:f>
+              <c:strCache>
+                <c:ptCount val="1"/>
+                <c:pt idx="0">
+                  <c:v>4</c:v>
+                </c:pt>
+              </c:strCache>
+            </c:strRef>
+          </c:tx>
+          <c:spPr>
+            <a:solidFill>
+              <a:schemeClr val="accent5"/>
+            </a:solidFill>
+            <a:ln>
+              <a:noFill/>
+            </a:ln>
+            <a:effectLst/>
+          </c:spPr>
+          <c:invertIfNegative val="0"/>
+          <c:cat>
+            <c:numRef>
+              <c:f>Sheet1!$A$2</c:f>
+              <c:numCache>
+                <c:formatCode>General</c:formatCode>
+                <c:ptCount val="1"/>
+              </c:numCache>
+            </c:numRef>
+          </c:cat>
+          <c:val>
+            <c:numRef>
+              <c:f>Sheet1!$F$2</c:f>
+              <c:numCache>
+                <c:formatCode>General</c:formatCode>
+                <c:ptCount val="1"/>
+                <c:pt idx="0">
+                  <c:v>0.25</c:v>
+                </c:pt>
+              </c:numCache>
+            </c:numRef>
+          </c:val>
+          <c:extLst>
+            <c:ext xmlns:c16="http://schemas.microsoft.com/office/drawing/2014/chart" uri="{C3380CC4-5D6E-409C-BE32-E72D297353CC}">
+              <c16:uniqueId val="{00000004-5CD4-4606-8032-F4C682E7B011}"/>
+            </c:ext>
+          </c:extLst>
+        </c:ser>
+        <c:ser>
+          <c:idx val="5"/>
+          <c:order val="5"/>
+          <c:tx>
+            <c:strRef>
+              <c:f>Sheet1!$G$1</c:f>
+              <c:strCache>
+                <c:ptCount val="1"/>
+                <c:pt idx="0">
+                  <c:v>5</c:v>
+                </c:pt>
+              </c:strCache>
+            </c:strRef>
+          </c:tx>
+          <c:spPr>
+            <a:solidFill>
+              <a:schemeClr val="accent6"/>
+            </a:solidFill>
+            <a:ln>
+              <a:noFill/>
+            </a:ln>
+            <a:effectLst/>
+          </c:spPr>
+          <c:invertIfNegative val="0"/>
+          <c:cat>
+            <c:numRef>
+              <c:f>Sheet1!$A$2</c:f>
+              <c:numCache>
+                <c:formatCode>General</c:formatCode>
+                <c:ptCount val="1"/>
+              </c:numCache>
+            </c:numRef>
+          </c:cat>
+          <c:val>
+            <c:numRef>
+              <c:f>Sheet1!$G$2</c:f>
+              <c:numCache>
+                <c:formatCode>General</c:formatCode>
+                <c:ptCount val="1"/>
+                <c:pt idx="0">
+                  <c:v>6.25E-2</c:v>
+                </c:pt>
+              </c:numCache>
+            </c:numRef>
+          </c:val>
+          <c:extLst>
+            <c:ext xmlns:c16="http://schemas.microsoft.com/office/drawing/2014/chart" uri="{C3380CC4-5D6E-409C-BE32-E72D297353CC}">
+              <c16:uniqueId val="{00000005-5CD4-4606-8032-F4C682E7B011}"/>
+            </c:ext>
+          </c:extLst>
+        </c:ser>
+        <c:ser>
+          <c:idx val="6"/>
+          <c:order val="6"/>
+          <c:tx>
+            <c:strRef>
+              <c:f>Sheet1!$H$1</c:f>
+              <c:strCache>
+                <c:ptCount val="1"/>
+                <c:pt idx="0">
+                  <c:v>6</c:v>
+                </c:pt>
+              </c:strCache>
+            </c:strRef>
+          </c:tx>
+          <c:spPr>
+            <a:solidFill>
+              <a:schemeClr val="accent1">
+                <a:lumMod val="60000"/>
+              </a:schemeClr>
+            </a:solidFill>
+            <a:ln>
+              <a:noFill/>
+            </a:ln>
+            <a:effectLst/>
+          </c:spPr>
+          <c:invertIfNegative val="0"/>
+          <c:cat>
+            <c:numRef>
+              <c:f>Sheet1!$A$2</c:f>
+              <c:numCache>
+                <c:formatCode>General</c:formatCode>
+                <c:ptCount val="1"/>
+              </c:numCache>
+            </c:numRef>
+          </c:cat>
+          <c:val>
+            <c:numRef>
+              <c:f>Sheet1!$H$2</c:f>
+              <c:numCache>
+                <c:formatCode>General</c:formatCode>
+                <c:ptCount val="1"/>
+                <c:pt idx="0">
+                  <c:v>0</c:v>
+                </c:pt>
+              </c:numCache>
+            </c:numRef>
+          </c:val>
+          <c:extLst>
+            <c:ext xmlns:c16="http://schemas.microsoft.com/office/drawing/2014/chart" uri="{C3380CC4-5D6E-409C-BE32-E72D297353CC}">
+              <c16:uniqueId val="{00000006-5CD4-4606-8032-F4C682E7B011}"/>
+            </c:ext>
+          </c:extLst>
+        </c:ser>
+        <c:ser>
+          <c:idx val="7"/>
+          <c:order val="7"/>
+          <c:tx>
+            <c:strRef>
+              <c:f>Sheet1!$I$1</c:f>
+              <c:strCache>
+                <c:ptCount val="1"/>
+                <c:pt idx="0">
+                  <c:v>7</c:v>
+                </c:pt>
+              </c:strCache>
+            </c:strRef>
+          </c:tx>
+          <c:spPr>
+            <a:solidFill>
+              <a:schemeClr val="accent2">
+                <a:lumMod val="60000"/>
+              </a:schemeClr>
+            </a:solidFill>
+            <a:ln>
+              <a:noFill/>
+            </a:ln>
+            <a:effectLst/>
+          </c:spPr>
+          <c:invertIfNegative val="0"/>
+          <c:cat>
+            <c:numRef>
+              <c:f>Sheet1!$A$2</c:f>
+              <c:numCache>
+                <c:formatCode>General</c:formatCode>
+                <c:ptCount val="1"/>
+              </c:numCache>
+            </c:numRef>
+          </c:cat>
+          <c:val>
+            <c:numRef>
+              <c:f>Sheet1!$I$2</c:f>
+              <c:numCache>
+                <c:formatCode>General</c:formatCode>
+                <c:ptCount val="1"/>
+                <c:pt idx="0">
+                  <c:v>0</c:v>
+                </c:pt>
+              </c:numCache>
+            </c:numRef>
+          </c:val>
+          <c:extLst>
+            <c:ext xmlns:c16="http://schemas.microsoft.com/office/drawing/2014/chart" uri="{C3380CC4-5D6E-409C-BE32-E72D297353CC}">
+              <c16:uniqueId val="{00000007-5CD4-4606-8032-F4C682E7B011}"/>
+            </c:ext>
+          </c:extLst>
+        </c:ser>
+        <c:dLbls>
+          <c:showLegendKey val="0"/>
+          <c:showVal val="0"/>
+          <c:showCatName val="0"/>
+          <c:showSerName val="0"/>
+          <c:showPercent val="0"/>
+          <c:showBubbleSize val="0"/>
+        </c:dLbls>
+        <c:gapWidth val="219"/>
+        <c:overlap val="-27"/>
+        <c:axId val="375177439"/>
+        <c:axId val="375187519"/>
+      </c:barChart>
+      <c:catAx>
+        <c:axId val="375177439"/>
+        <c:scaling>
+          <c:orientation val="minMax"/>
+        </c:scaling>
+        <c:delete val="0"/>
+        <c:axPos val="b"/>
+        <c:numFmt formatCode="General" sourceLinked="1"/>
+        <c:majorTickMark val="none"/>
+        <c:minorTickMark val="none"/>
+        <c:tickLblPos val="nextTo"/>
+        <c:spPr>
+          <a:noFill/>
+          <a:ln w="9525" cap="flat" cmpd="sng" algn="ctr">
+            <a:solidFill>
+              <a:schemeClr val="tx1">
+                <a:lumMod val="15000"/>
+                <a:lumOff val="85000"/>
+              </a:schemeClr>
+            </a:solidFill>
+            <a:round/>
+          </a:ln>
+          <a:effectLst/>
+        </c:spPr>
+        <c:txPr>
+          <a:bodyPr rot="-60000000" spcFirstLastPara="1" vertOverflow="ellipsis" vert="horz" wrap="square" anchor="ctr" anchorCtr="1"/>
+          <a:lstStyle/>
+          <a:p>
+            <a:pPr>
+              <a:defRPr sz="900" b="0" i="0" u="none" strike="noStrike" kern="1200" baseline="0">
+                <a:solidFill>
+                  <a:schemeClr val="tx1">
+                    <a:lumMod val="65000"/>
+                    <a:lumOff val="35000"/>
+                  </a:schemeClr>
+                </a:solidFill>
+                <a:latin typeface="+mn-lt"/>
+                <a:ea typeface="+mn-ea"/>
+                <a:cs typeface="+mn-cs"/>
+              </a:defRPr>
+            </a:pPr>
+            <a:endParaRPr lang="en-US"/>
+          </a:p>
+        </c:txPr>
+        <c:crossAx val="375187519"/>
+        <c:crosses val="autoZero"/>
+        <c:auto val="1"/>
+        <c:lblAlgn val="ctr"/>
+        <c:lblOffset val="100"/>
+        <c:noMultiLvlLbl val="0"/>
+      </c:catAx>
+      <c:valAx>
+        <c:axId val="375187519"/>
+        <c:scaling>
+          <c:orientation val="minMax"/>
+        </c:scaling>
+        <c:delete val="0"/>
+        <c:axPos val="l"/>
+        <c:majorGridlines>
+          <c:spPr>
+            <a:ln w="9525" cap="flat" cmpd="sng" algn="ctr">
+              <a:solidFill>
+                <a:schemeClr val="tx1">
+                  <a:lumMod val="15000"/>
+                  <a:lumOff val="85000"/>
+                </a:schemeClr>
+              </a:solidFill>
+              <a:round/>
+            </a:ln>
+            <a:effectLst/>
+          </c:spPr>
+        </c:majorGridlines>
+        <c:numFmt formatCode="General" sourceLinked="1"/>
+        <c:majorTickMark val="none"/>
+        <c:minorTickMark val="none"/>
+        <c:tickLblPos val="nextTo"/>
+        <c:spPr>
+          <a:noFill/>
+          <a:ln>
+            <a:noFill/>
+          </a:ln>
+          <a:effectLst/>
+        </c:spPr>
+        <c:txPr>
+          <a:bodyPr rot="-60000000" spcFirstLastPara="1" vertOverflow="ellipsis" vert="horz" wrap="square" anchor="ctr" anchorCtr="1"/>
+          <a:lstStyle/>
+          <a:p>
+            <a:pPr>
+              <a:defRPr sz="900" b="0" i="0" u="none" strike="noStrike" kern="1200" baseline="0">
+                <a:solidFill>
+                  <a:schemeClr val="tx1">
+                    <a:lumMod val="65000"/>
+                    <a:lumOff val="35000"/>
+                  </a:schemeClr>
+                </a:solidFill>
+                <a:latin typeface="+mn-lt"/>
+                <a:ea typeface="+mn-ea"/>
+                <a:cs typeface="+mn-cs"/>
+              </a:defRPr>
+            </a:pPr>
+            <a:endParaRPr lang="en-US"/>
+          </a:p>
+        </c:txPr>
+        <c:crossAx val="375177439"/>
+        <c:crosses val="autoZero"/>
+        <c:crossBetween val="between"/>
+      </c:valAx>
+      <c:spPr>
+        <a:noFill/>
+        <a:ln>
+          <a:noFill/>
+        </a:ln>
+        <a:effectLst/>
+      </c:spPr>
+    </c:plotArea>
+    <c:legend>
+      <c:legendPos val="b"/>
+      <c:overlay val="0"/>
+      <c:spPr>
+        <a:noFill/>
+        <a:ln>
+          <a:noFill/>
+        </a:ln>
+        <a:effectLst/>
+      </c:spPr>
+      <c:txPr>
+        <a:bodyPr rot="0" spcFirstLastPara="1" vertOverflow="ellipsis" vert="horz" wrap="square" anchor="ctr" anchorCtr="1"/>
+        <a:lstStyle/>
+        <a:p>
+          <a:pPr>
+            <a:defRPr sz="900" b="0" i="0" u="none" strike="noStrike" kern="1200" baseline="0">
+              <a:solidFill>
+                <a:schemeClr val="tx1">
+                  <a:lumMod val="65000"/>
+                  <a:lumOff val="35000"/>
+                </a:schemeClr>
+              </a:solidFill>
+              <a:latin typeface="+mn-lt"/>
+              <a:ea typeface="+mn-ea"/>
+              <a:cs typeface="+mn-cs"/>
+            </a:defRPr>
+          </a:pPr>
+          <a:endParaRPr lang="en-US"/>
+        </a:p>
+      </c:txPr>
+    </c:legend>
+    <c:plotVisOnly val="1"/>
+    <c:dispBlanksAs val="gap"/>
+    <c:extLst>
+      <c:ext xmlns:c16r3="http://schemas.microsoft.com/office/drawing/2017/03/chart" uri="{56B9EC1D-385E-4148-901F-78D8002777C0}">
+        <c16r3:dataDisplayOptions16>
+          <c16r3:dispNaAsBlank val="1"/>
+        </c16r3:dataDisplayOptions16>
+      </c:ext>
+    </c:extLst>
+    <c:showDLblsOverMax val="0"/>
+  </c:chart>
+  <c:spPr>
+    <a:solidFill>
+      <a:schemeClr val="bg1"/>
+    </a:solidFill>
+    <a:ln w="9525" cap="flat" cmpd="sng" algn="ctr">
+      <a:solidFill>
+        <a:schemeClr val="tx1">
+          <a:lumMod val="15000"/>
+          <a:lumOff val="85000"/>
+        </a:schemeClr>
+      </a:solidFill>
+      <a:round/>
+    </a:ln>
+    <a:effectLst/>
+  </c:spPr>
+  <c:txPr>
+    <a:bodyPr/>
+    <a:lstStyle/>
+    <a:p>
+      <a:pPr>
+        <a:defRPr/>
+      </a:pPr>
+      <a:endParaRPr lang="en-US"/>
+    </a:p>
+  </c:txPr>
+  <c:externalData r:id="rId3">
+    <c:autoUpdate val="0"/>
+  </c:externalData>
+</c:chartSpace>
+</file>
+
+<file path=word/charts/chart4.xml><?xml version="1.0" encoding="utf-8"?>
+<c:chartSpace xmlns:c="http://schemas.openxmlformats.org/drawingml/2006/chart" xmlns:a="http://schemas.openxmlformats.org/drawingml/2006/main" xmlns:r="http://schemas.openxmlformats.org/officeDocument/2006/relationships" xmlns:c16r2="http://schemas.microsoft.com/office/drawing/2015/06/chart">
+  <c:date1904 val="0"/>
+  <c:lang val="en-US"/>
+  <c:roundedCorners val="0"/>
+  <mc:AlternateContent xmlns:mc="http://schemas.openxmlformats.org/markup-compatibility/2006">
+    <mc:Choice xmlns:c14="http://schemas.microsoft.com/office/drawing/2007/8/2/chart" Requires="c14">
+      <c14:style val="102"/>
+    </mc:Choice>
+    <mc:Fallback>
+      <c:style val="2"/>
+    </mc:Fallback>
+  </mc:AlternateContent>
+  <c:chart>
+    <c:title>
+      <c:tx>
+        <c:rich>
+          <a:bodyPr rot="0" spcFirstLastPara="1" vertOverflow="ellipsis" vert="horz" wrap="square" anchor="ctr" anchorCtr="1"/>
+          <a:lstStyle/>
+          <a:p>
+            <a:pPr>
+              <a:defRPr sz="1400" b="0" i="0" u="none" strike="noStrike" kern="1200" spc="0" baseline="0">
+                <a:solidFill>
+                  <a:schemeClr val="tx1">
+                    <a:lumMod val="65000"/>
+                    <a:lumOff val="35000"/>
+                  </a:schemeClr>
+                </a:solidFill>
+                <a:latin typeface="+mn-lt"/>
+                <a:ea typeface="+mn-ea"/>
+                <a:cs typeface="+mn-cs"/>
+              </a:defRPr>
+            </a:pPr>
+            <a:r>
+              <a:rPr lang="en-ID" sz="1100"/>
+              <a:t>Histogram Probabilitas Setelah Equalisasi</a:t>
+            </a:r>
+          </a:p>
+        </c:rich>
+      </c:tx>
+      <c:overlay val="0"/>
+      <c:spPr>
+        <a:noFill/>
+        <a:ln>
+          <a:noFill/>
+        </a:ln>
+        <a:effectLst/>
+      </c:spPr>
+      <c:txPr>
+        <a:bodyPr rot="0" spcFirstLastPara="1" vertOverflow="ellipsis" vert="horz" wrap="square" anchor="ctr" anchorCtr="1"/>
+        <a:lstStyle/>
+        <a:p>
+          <a:pPr>
+            <a:defRPr sz="1400" b="0" i="0" u="none" strike="noStrike" kern="1200" spc="0" baseline="0">
+              <a:solidFill>
+                <a:schemeClr val="tx1">
+                  <a:lumMod val="65000"/>
+                  <a:lumOff val="35000"/>
+                </a:schemeClr>
+              </a:solidFill>
+              <a:latin typeface="+mn-lt"/>
+              <a:ea typeface="+mn-ea"/>
+              <a:cs typeface="+mn-cs"/>
+            </a:defRPr>
+          </a:pPr>
+          <a:endParaRPr lang="en-US"/>
+        </a:p>
+      </c:txPr>
+    </c:title>
+    <c:autoTitleDeleted val="0"/>
+    <c:plotArea>
+      <c:layout/>
+      <c:barChart>
+        <c:barDir val="col"/>
+        <c:grouping val="clustered"/>
+        <c:varyColors val="0"/>
+        <c:ser>
+          <c:idx val="0"/>
+          <c:order val="0"/>
+          <c:tx>
+            <c:strRef>
+              <c:f>Sheet1!$B$1</c:f>
+              <c:strCache>
+                <c:ptCount val="1"/>
+                <c:pt idx="0">
+                  <c:v>0</c:v>
+                </c:pt>
+              </c:strCache>
+            </c:strRef>
+          </c:tx>
+          <c:spPr>
+            <a:solidFill>
+              <a:schemeClr val="accent1"/>
+            </a:solidFill>
+            <a:ln>
+              <a:noFill/>
+            </a:ln>
+            <a:effectLst/>
+          </c:spPr>
+          <c:invertIfNegative val="0"/>
+          <c:cat>
+            <c:numRef>
+              <c:f>Sheet1!$A$2</c:f>
+              <c:numCache>
+                <c:formatCode>General</c:formatCode>
+                <c:ptCount val="1"/>
+              </c:numCache>
+            </c:numRef>
+          </c:cat>
+          <c:val>
+            <c:numRef>
+              <c:f>Sheet1!$B$2</c:f>
+              <c:numCache>
+                <c:formatCode>General</c:formatCode>
+                <c:ptCount val="1"/>
+                <c:pt idx="0">
+                  <c:v>0</c:v>
+                </c:pt>
+              </c:numCache>
+            </c:numRef>
+          </c:val>
+          <c:extLst>
+            <c:ext xmlns:c16="http://schemas.microsoft.com/office/drawing/2014/chart" uri="{C3380CC4-5D6E-409C-BE32-E72D297353CC}">
+              <c16:uniqueId val="{00000000-8971-4D28-9A18-B341CFC52CB6}"/>
+            </c:ext>
+          </c:extLst>
+        </c:ser>
+        <c:ser>
+          <c:idx val="1"/>
+          <c:order val="1"/>
+          <c:tx>
+            <c:strRef>
+              <c:f>Sheet1!$C$1</c:f>
+              <c:strCache>
+                <c:ptCount val="1"/>
+                <c:pt idx="0">
+                  <c:v>1</c:v>
+                </c:pt>
+              </c:strCache>
+            </c:strRef>
+          </c:tx>
+          <c:spPr>
+            <a:solidFill>
+              <a:schemeClr val="accent2"/>
+            </a:solidFill>
+            <a:ln>
+              <a:noFill/>
+            </a:ln>
+            <a:effectLst/>
+          </c:spPr>
+          <c:invertIfNegative val="0"/>
+          <c:cat>
+            <c:numRef>
+              <c:f>Sheet1!$A$2</c:f>
+              <c:numCache>
+                <c:formatCode>General</c:formatCode>
+                <c:ptCount val="1"/>
+              </c:numCache>
+            </c:numRef>
+          </c:cat>
+          <c:val>
+            <c:numRef>
+              <c:f>Sheet1!$C$2</c:f>
+              <c:numCache>
+                <c:formatCode>General</c:formatCode>
+                <c:ptCount val="1"/>
+                <c:pt idx="0">
+                  <c:v>0.375</c:v>
                 </c:pt>
               </c:numCache>
             </c:numRef>
@@ -6872,7 +8557,7 @@
               <c:strCache>
                 <c:ptCount val="1"/>
                 <c:pt idx="0">
-                  <c:v>3</c:v>
+                  <c:v>2</c:v>
                 </c:pt>
               </c:strCache>
             </c:strRef>
@@ -6911,6 +8596,265 @@
           <c:extLst>
             <c:ext xmlns:c16="http://schemas.microsoft.com/office/drawing/2014/chart" uri="{C3380CC4-5D6E-409C-BE32-E72D297353CC}">
               <c16:uniqueId val="{00000002-8971-4D28-9A18-B341CFC52CB6}"/>
+            </c:ext>
+          </c:extLst>
+        </c:ser>
+        <c:ser>
+          <c:idx val="3"/>
+          <c:order val="3"/>
+          <c:tx>
+            <c:strRef>
+              <c:f>Sheet1!$E$1</c:f>
+              <c:strCache>
+                <c:ptCount val="1"/>
+                <c:pt idx="0">
+                  <c:v>3</c:v>
+                </c:pt>
+              </c:strCache>
+            </c:strRef>
+          </c:tx>
+          <c:spPr>
+            <a:solidFill>
+              <a:schemeClr val="accent4"/>
+            </a:solidFill>
+            <a:ln>
+              <a:noFill/>
+            </a:ln>
+            <a:effectLst/>
+          </c:spPr>
+          <c:invertIfNegative val="0"/>
+          <c:cat>
+            <c:numRef>
+              <c:f>Sheet1!$A$2</c:f>
+              <c:numCache>
+                <c:formatCode>General</c:formatCode>
+                <c:ptCount val="1"/>
+              </c:numCache>
+            </c:numRef>
+          </c:cat>
+          <c:val>
+            <c:numRef>
+              <c:f>Sheet1!$E$2</c:f>
+              <c:numCache>
+                <c:formatCode>General</c:formatCode>
+                <c:ptCount val="1"/>
+                <c:pt idx="0">
+                  <c:v>0.3125</c:v>
+                </c:pt>
+              </c:numCache>
+            </c:numRef>
+          </c:val>
+          <c:extLst>
+            <c:ext xmlns:c16="http://schemas.microsoft.com/office/drawing/2014/chart" uri="{C3380CC4-5D6E-409C-BE32-E72D297353CC}">
+              <c16:uniqueId val="{00000000-24C1-45BA-97F1-D340DB2EFA73}"/>
+            </c:ext>
+          </c:extLst>
+        </c:ser>
+        <c:ser>
+          <c:idx val="4"/>
+          <c:order val="4"/>
+          <c:tx>
+            <c:strRef>
+              <c:f>Sheet1!$F$1</c:f>
+              <c:strCache>
+                <c:ptCount val="1"/>
+                <c:pt idx="0">
+                  <c:v>4</c:v>
+                </c:pt>
+              </c:strCache>
+            </c:strRef>
+          </c:tx>
+          <c:spPr>
+            <a:solidFill>
+              <a:schemeClr val="accent5"/>
+            </a:solidFill>
+            <a:ln>
+              <a:noFill/>
+            </a:ln>
+            <a:effectLst/>
+          </c:spPr>
+          <c:invertIfNegative val="0"/>
+          <c:cat>
+            <c:numRef>
+              <c:f>Sheet1!$A$2</c:f>
+              <c:numCache>
+                <c:formatCode>General</c:formatCode>
+                <c:ptCount val="1"/>
+              </c:numCache>
+            </c:numRef>
+          </c:cat>
+          <c:val>
+            <c:numRef>
+              <c:f>Sheet1!$F$2</c:f>
+              <c:numCache>
+                <c:formatCode>General</c:formatCode>
+                <c:ptCount val="1"/>
+                <c:pt idx="0">
+                  <c:v>0</c:v>
+                </c:pt>
+              </c:numCache>
+            </c:numRef>
+          </c:val>
+          <c:extLst>
+            <c:ext xmlns:c16="http://schemas.microsoft.com/office/drawing/2014/chart" uri="{C3380CC4-5D6E-409C-BE32-E72D297353CC}">
+              <c16:uniqueId val="{00000001-24C1-45BA-97F1-D340DB2EFA73}"/>
+            </c:ext>
+          </c:extLst>
+        </c:ser>
+        <c:ser>
+          <c:idx val="5"/>
+          <c:order val="5"/>
+          <c:tx>
+            <c:strRef>
+              <c:f>Sheet1!$G$1</c:f>
+              <c:strCache>
+                <c:ptCount val="1"/>
+                <c:pt idx="0">
+                  <c:v>5</c:v>
+                </c:pt>
+              </c:strCache>
+            </c:strRef>
+          </c:tx>
+          <c:spPr>
+            <a:solidFill>
+              <a:schemeClr val="accent6"/>
+            </a:solidFill>
+            <a:ln>
+              <a:noFill/>
+            </a:ln>
+            <a:effectLst/>
+          </c:spPr>
+          <c:invertIfNegative val="0"/>
+          <c:cat>
+            <c:numRef>
+              <c:f>Sheet1!$A$2</c:f>
+              <c:numCache>
+                <c:formatCode>General</c:formatCode>
+                <c:ptCount val="1"/>
+              </c:numCache>
+            </c:numRef>
+          </c:cat>
+          <c:val>
+            <c:numRef>
+              <c:f>Sheet1!$G$2</c:f>
+              <c:numCache>
+                <c:formatCode>General</c:formatCode>
+                <c:ptCount val="1"/>
+                <c:pt idx="0">
+                  <c:v>0</c:v>
+                </c:pt>
+              </c:numCache>
+            </c:numRef>
+          </c:val>
+          <c:extLst>
+            <c:ext xmlns:c16="http://schemas.microsoft.com/office/drawing/2014/chart" uri="{C3380CC4-5D6E-409C-BE32-E72D297353CC}">
+              <c16:uniqueId val="{00000002-24C1-45BA-97F1-D340DB2EFA73}"/>
+            </c:ext>
+          </c:extLst>
+        </c:ser>
+        <c:ser>
+          <c:idx val="6"/>
+          <c:order val="6"/>
+          <c:tx>
+            <c:strRef>
+              <c:f>Sheet1!$H$1</c:f>
+              <c:strCache>
+                <c:ptCount val="1"/>
+                <c:pt idx="0">
+                  <c:v>6</c:v>
+                </c:pt>
+              </c:strCache>
+            </c:strRef>
+          </c:tx>
+          <c:spPr>
+            <a:solidFill>
+              <a:schemeClr val="accent1">
+                <a:lumMod val="60000"/>
+              </a:schemeClr>
+            </a:solidFill>
+            <a:ln>
+              <a:noFill/>
+            </a:ln>
+            <a:effectLst/>
+          </c:spPr>
+          <c:invertIfNegative val="0"/>
+          <c:cat>
+            <c:numRef>
+              <c:f>Sheet1!$A$2</c:f>
+              <c:numCache>
+                <c:formatCode>General</c:formatCode>
+                <c:ptCount val="1"/>
+              </c:numCache>
+            </c:numRef>
+          </c:cat>
+          <c:val>
+            <c:numRef>
+              <c:f>Sheet1!$H$2</c:f>
+              <c:numCache>
+                <c:formatCode>General</c:formatCode>
+                <c:ptCount val="1"/>
+                <c:pt idx="0">
+                  <c:v>0</c:v>
+                </c:pt>
+              </c:numCache>
+            </c:numRef>
+          </c:val>
+          <c:extLst>
+            <c:ext xmlns:c16="http://schemas.microsoft.com/office/drawing/2014/chart" uri="{C3380CC4-5D6E-409C-BE32-E72D297353CC}">
+              <c16:uniqueId val="{00000003-24C1-45BA-97F1-D340DB2EFA73}"/>
+            </c:ext>
+          </c:extLst>
+        </c:ser>
+        <c:ser>
+          <c:idx val="7"/>
+          <c:order val="7"/>
+          <c:tx>
+            <c:strRef>
+              <c:f>Sheet1!$I$1</c:f>
+              <c:strCache>
+                <c:ptCount val="1"/>
+                <c:pt idx="0">
+                  <c:v>7</c:v>
+                </c:pt>
+              </c:strCache>
+            </c:strRef>
+          </c:tx>
+          <c:spPr>
+            <a:solidFill>
+              <a:schemeClr val="accent2">
+                <a:lumMod val="60000"/>
+              </a:schemeClr>
+            </a:solidFill>
+            <a:ln>
+              <a:noFill/>
+            </a:ln>
+            <a:effectLst/>
+          </c:spPr>
+          <c:invertIfNegative val="0"/>
+          <c:cat>
+            <c:numRef>
+              <c:f>Sheet1!$A$2</c:f>
+              <c:numCache>
+                <c:formatCode>General</c:formatCode>
+                <c:ptCount val="1"/>
+              </c:numCache>
+            </c:numRef>
+          </c:cat>
+          <c:val>
+            <c:numRef>
+              <c:f>Sheet1!$I$2</c:f>
+              <c:numCache>
+                <c:formatCode>General</c:formatCode>
+                <c:ptCount val="1"/>
+                <c:pt idx="0">
+                  <c:v>0</c:v>
+                </c:pt>
+              </c:numCache>
+            </c:numRef>
+          </c:val>
+          <c:extLst>
+            <c:ext xmlns:c16="http://schemas.microsoft.com/office/drawing/2014/chart" uri="{C3380CC4-5D6E-409C-BE32-E72D297353CC}">
+              <c16:uniqueId val="{00000004-24C1-45BA-97F1-D340DB2EFA73}"/>
             </c:ext>
           </c:extLst>
         </c:ser>
@@ -7195,6 +9139,86 @@
 </cs:colorStyle>
 </file>
 
+<file path=word/charts/colors3.xml><?xml version="1.0" encoding="utf-8"?>
+<cs:colorStyle xmlns:cs="http://schemas.microsoft.com/office/drawing/2012/chartStyle" xmlns:a="http://schemas.openxmlformats.org/drawingml/2006/main" meth="cycle" id="10">
+  <a:schemeClr val="accent1"/>
+  <a:schemeClr val="accent2"/>
+  <a:schemeClr val="accent3"/>
+  <a:schemeClr val="accent4"/>
+  <a:schemeClr val="accent5"/>
+  <a:schemeClr val="accent6"/>
+  <cs:variation/>
+  <cs:variation>
+    <a:lumMod val="60000"/>
+  </cs:variation>
+  <cs:variation>
+    <a:lumMod val="80000"/>
+    <a:lumOff val="20000"/>
+  </cs:variation>
+  <cs:variation>
+    <a:lumMod val="80000"/>
+  </cs:variation>
+  <cs:variation>
+    <a:lumMod val="60000"/>
+    <a:lumOff val="40000"/>
+  </cs:variation>
+  <cs:variation>
+    <a:lumMod val="50000"/>
+  </cs:variation>
+  <cs:variation>
+    <a:lumMod val="70000"/>
+    <a:lumOff val="30000"/>
+  </cs:variation>
+  <cs:variation>
+    <a:lumMod val="70000"/>
+  </cs:variation>
+  <cs:variation>
+    <a:lumMod val="50000"/>
+    <a:lumOff val="50000"/>
+  </cs:variation>
+</cs:colorStyle>
+</file>
+
+<file path=word/charts/colors4.xml><?xml version="1.0" encoding="utf-8"?>
+<cs:colorStyle xmlns:cs="http://schemas.microsoft.com/office/drawing/2012/chartStyle" xmlns:a="http://schemas.openxmlformats.org/drawingml/2006/main" meth="cycle" id="10">
+  <a:schemeClr val="accent1"/>
+  <a:schemeClr val="accent2"/>
+  <a:schemeClr val="accent3"/>
+  <a:schemeClr val="accent4"/>
+  <a:schemeClr val="accent5"/>
+  <a:schemeClr val="accent6"/>
+  <cs:variation/>
+  <cs:variation>
+    <a:lumMod val="60000"/>
+  </cs:variation>
+  <cs:variation>
+    <a:lumMod val="80000"/>
+    <a:lumOff val="20000"/>
+  </cs:variation>
+  <cs:variation>
+    <a:lumMod val="80000"/>
+  </cs:variation>
+  <cs:variation>
+    <a:lumMod val="60000"/>
+    <a:lumOff val="40000"/>
+  </cs:variation>
+  <cs:variation>
+    <a:lumMod val="50000"/>
+  </cs:variation>
+  <cs:variation>
+    <a:lumMod val="70000"/>
+    <a:lumOff val="30000"/>
+  </cs:variation>
+  <cs:variation>
+    <a:lumMod val="70000"/>
+  </cs:variation>
+  <cs:variation>
+    <a:lumMod val="50000"/>
+    <a:lumOff val="50000"/>
+  </cs:variation>
+</cs:colorStyle>
+</file>
+
 <file path=word/charts/style1.xml><?xml version="1.0" encoding="utf-8"?>
 <cs:chartStyle xmlns:cs="http://schemas.microsoft.com/office/drawing/2012/chartStyle" xmlns:a="http://schemas.openxmlformats.org/drawingml/2006/main" id="201">
   <cs:axisTitle>
@@ -7699,6 +9723,1012 @@
 </file>
 
 <file path=word/charts/style2.xml><?xml version="1.0" encoding="utf-8"?>
+<cs:chartStyle xmlns:cs="http://schemas.microsoft.com/office/drawing/2012/chartStyle" xmlns:a="http://schemas.openxmlformats.org/drawingml/2006/main" id="201">
+  <cs:axisTitle>
+    <cs:lnRef idx="0"/>
+    <cs:fillRef idx="0"/>
+    <cs:effectRef idx="0"/>
+    <cs:fontRef idx="minor">
+      <a:schemeClr val="tx1">
+        <a:lumMod val="65000"/>
+        <a:lumOff val="35000"/>
+      </a:schemeClr>
+    </cs:fontRef>
+    <cs:defRPr sz="1000" kern="1200"/>
+  </cs:axisTitle>
+  <cs:categoryAxis>
+    <cs:lnRef idx="0"/>
+    <cs:fillRef idx="0"/>
+    <cs:effectRef idx="0"/>
+    <cs:fontRef idx="minor">
+      <a:schemeClr val="tx1">
+        <a:lumMod val="65000"/>
+        <a:lumOff val="35000"/>
+      </a:schemeClr>
+    </cs:fontRef>
+    <cs:spPr>
+      <a:ln w="9525" cap="flat" cmpd="sng" algn="ctr">
+        <a:solidFill>
+          <a:schemeClr val="tx1">
+            <a:lumMod val="15000"/>
+            <a:lumOff val="85000"/>
+          </a:schemeClr>
+        </a:solidFill>
+        <a:round/>
+      </a:ln>
+    </cs:spPr>
+    <cs:defRPr sz="900" kern="1200"/>
+  </cs:categoryAxis>
+  <cs:chartArea mods="allowNoFillOverride allowNoLineOverride">
+    <cs:lnRef idx="0"/>
+    <cs:fillRef idx="0"/>
+    <cs:effectRef idx="0"/>
+    <cs:fontRef idx="minor">
+      <a:schemeClr val="tx1"/>
+    </cs:fontRef>
+    <cs:spPr>
+      <a:solidFill>
+        <a:schemeClr val="bg1"/>
+      </a:solidFill>
+      <a:ln w="9525" cap="flat" cmpd="sng" algn="ctr">
+        <a:solidFill>
+          <a:schemeClr val="tx1">
+            <a:lumMod val="15000"/>
+            <a:lumOff val="85000"/>
+          </a:schemeClr>
+        </a:solidFill>
+        <a:round/>
+      </a:ln>
+    </cs:spPr>
+    <cs:defRPr sz="1000" kern="1200"/>
+  </cs:chartArea>
+  <cs:dataLabel>
+    <cs:lnRef idx="0"/>
+    <cs:fillRef idx="0"/>
+    <cs:effectRef idx="0"/>
+    <cs:fontRef idx="minor">
+      <a:schemeClr val="tx1">
+        <a:lumMod val="75000"/>
+        <a:lumOff val="25000"/>
+      </a:schemeClr>
+    </cs:fontRef>
+    <cs:defRPr sz="900" kern="1200"/>
+  </cs:dataLabel>
+  <cs:dataLabelCallout>
+    <cs:lnRef idx="0"/>
+    <cs:fillRef idx="0"/>
+    <cs:effectRef idx="0"/>
+    <cs:fontRef idx="minor">
+      <a:schemeClr val="dk1">
+        <a:lumMod val="65000"/>
+        <a:lumOff val="35000"/>
+      </a:schemeClr>
+    </cs:fontRef>
+    <cs:spPr>
+      <a:solidFill>
+        <a:schemeClr val="lt1"/>
+      </a:solidFill>
+      <a:ln>
+        <a:solidFill>
+          <a:schemeClr val="dk1">
+            <a:lumMod val="25000"/>
+            <a:lumOff val="75000"/>
+          </a:schemeClr>
+        </a:solidFill>
+      </a:ln>
+    </cs:spPr>
+    <cs:defRPr sz="900" kern="1200"/>
+    <cs:bodyPr rot="0" spcFirstLastPara="1" vertOverflow="clip" horzOverflow="clip" vert="horz" wrap="square" lIns="36576" tIns="18288" rIns="36576" bIns="18288" anchor="ctr" anchorCtr="1">
+      <a:spAutoFit/>
+    </cs:bodyPr>
+  </cs:dataLabelCallout>
+  <cs:dataPoint>
+    <cs:lnRef idx="0"/>
+    <cs:fillRef idx="1">
+      <cs:styleClr val="auto"/>
+    </cs:fillRef>
+    <cs:effectRef idx="0"/>
+    <cs:fontRef idx="minor">
+      <a:schemeClr val="tx1"/>
+    </cs:fontRef>
+  </cs:dataPoint>
+  <cs:dataPoint3D>
+    <cs:lnRef idx="0"/>
+    <cs:fillRef idx="1">
+      <cs:styleClr val="auto"/>
+    </cs:fillRef>
+    <cs:effectRef idx="0"/>
+    <cs:fontRef idx="minor">
+      <a:schemeClr val="tx1"/>
+    </cs:fontRef>
+  </cs:dataPoint3D>
+  <cs:dataPointLine>
+    <cs:lnRef idx="0">
+      <cs:styleClr val="auto"/>
+    </cs:lnRef>
+    <cs:fillRef idx="1"/>
+    <cs:effectRef idx="0"/>
+    <cs:fontRef idx="minor">
+      <a:schemeClr val="tx1"/>
+    </cs:fontRef>
+    <cs:spPr>
+      <a:ln w="28575" cap="rnd">
+        <a:solidFill>
+          <a:schemeClr val="phClr"/>
+        </a:solidFill>
+        <a:round/>
+      </a:ln>
+    </cs:spPr>
+  </cs:dataPointLine>
+  <cs:dataPointMarker>
+    <cs:lnRef idx="0">
+      <cs:styleClr val="auto"/>
+    </cs:lnRef>
+    <cs:fillRef idx="1">
+      <cs:styleClr val="auto"/>
+    </cs:fillRef>
+    <cs:effectRef idx="0"/>
+    <cs:fontRef idx="minor">
+      <a:schemeClr val="tx1"/>
+    </cs:fontRef>
+    <cs:spPr>
+      <a:ln w="9525">
+        <a:solidFill>
+          <a:schemeClr val="phClr"/>
+        </a:solidFill>
+      </a:ln>
+    </cs:spPr>
+  </cs:dataPointMarker>
+  <cs:dataPointMarkerLayout symbol="circle" size="5"/>
+  <cs:dataPointWireframe>
+    <cs:lnRef idx="0">
+      <cs:styleClr val="auto"/>
+    </cs:lnRef>
+    <cs:fillRef idx="1"/>
+    <cs:effectRef idx="0"/>
+    <cs:fontRef idx="minor">
+      <a:schemeClr val="tx1"/>
+    </cs:fontRef>
+    <cs:spPr>
+      <a:ln w="9525" cap="rnd">
+        <a:solidFill>
+          <a:schemeClr val="phClr"/>
+        </a:solidFill>
+        <a:round/>
+      </a:ln>
+    </cs:spPr>
+  </cs:dataPointWireframe>
+  <cs:dataTable>
+    <cs:lnRef idx="0"/>
+    <cs:fillRef idx="0"/>
+    <cs:effectRef idx="0"/>
+    <cs:fontRef idx="minor">
+      <a:schemeClr val="tx1">
+        <a:lumMod val="65000"/>
+        <a:lumOff val="35000"/>
+      </a:schemeClr>
+    </cs:fontRef>
+    <cs:spPr>
+      <a:noFill/>
+      <a:ln w="9525" cap="flat" cmpd="sng" algn="ctr">
+        <a:solidFill>
+          <a:schemeClr val="tx1">
+            <a:lumMod val="15000"/>
+            <a:lumOff val="85000"/>
+          </a:schemeClr>
+        </a:solidFill>
+        <a:round/>
+      </a:ln>
+    </cs:spPr>
+    <cs:defRPr sz="900" kern="1200"/>
+  </cs:dataTable>
+  <cs:downBar>
+    <cs:lnRef idx="0"/>
+    <cs:fillRef idx="0"/>
+    <cs:effectRef idx="0"/>
+    <cs:fontRef idx="minor">
+      <a:schemeClr val="dk1"/>
+    </cs:fontRef>
+    <cs:spPr>
+      <a:solidFill>
+        <a:schemeClr val="dk1">
+          <a:lumMod val="65000"/>
+          <a:lumOff val="35000"/>
+        </a:schemeClr>
+      </a:solidFill>
+      <a:ln w="9525">
+        <a:solidFill>
+          <a:schemeClr val="tx1">
+            <a:lumMod val="65000"/>
+            <a:lumOff val="35000"/>
+          </a:schemeClr>
+        </a:solidFill>
+      </a:ln>
+    </cs:spPr>
+  </cs:downBar>
+  <cs:dropLine>
+    <cs:lnRef idx="0"/>
+    <cs:fillRef idx="0"/>
+    <cs:effectRef idx="0"/>
+    <cs:fontRef idx="minor">
+      <a:schemeClr val="tx1"/>
+    </cs:fontRef>
+    <cs:spPr>
+      <a:ln w="9525" cap="flat" cmpd="sng" algn="ctr">
+        <a:solidFill>
+          <a:schemeClr val="tx1">
+            <a:lumMod val="35000"/>
+            <a:lumOff val="65000"/>
+          </a:schemeClr>
+        </a:solidFill>
+        <a:round/>
+      </a:ln>
+    </cs:spPr>
+  </cs:dropLine>
+  <cs:errorBar>
+    <cs:lnRef idx="0"/>
+    <cs:fillRef idx="0"/>
+    <cs:effectRef idx="0"/>
+    <cs:fontRef idx="minor">
+      <a:schemeClr val="tx1"/>
+    </cs:fontRef>
+    <cs:spPr>
+      <a:ln w="9525" cap="flat" cmpd="sng" algn="ctr">
+        <a:solidFill>
+          <a:schemeClr val="tx1">
+            <a:lumMod val="65000"/>
+            <a:lumOff val="35000"/>
+          </a:schemeClr>
+        </a:solidFill>
+        <a:round/>
+      </a:ln>
+    </cs:spPr>
+  </cs:errorBar>
+  <cs:floor>
+    <cs:lnRef idx="0"/>
+    <cs:fillRef idx="0"/>
+    <cs:effectRef idx="0"/>
+    <cs:fontRef idx="minor">
+      <a:schemeClr val="tx1"/>
+    </cs:fontRef>
+    <cs:spPr>
+      <a:noFill/>
+      <a:ln>
+        <a:noFill/>
+      </a:ln>
+    </cs:spPr>
+  </cs:floor>
+  <cs:gridlineMajor>
+    <cs:lnRef idx="0"/>
+    <cs:fillRef idx="0"/>
+    <cs:effectRef idx="0"/>
+    <cs:fontRef idx="minor">
+      <a:schemeClr val="tx1"/>
+    </cs:fontRef>
+    <cs:spPr>
+      <a:ln w="9525" cap="flat" cmpd="sng" algn="ctr">
+        <a:solidFill>
+          <a:schemeClr val="tx1">
+            <a:lumMod val="15000"/>
+            <a:lumOff val="85000"/>
+          </a:schemeClr>
+        </a:solidFill>
+        <a:round/>
+      </a:ln>
+    </cs:spPr>
+  </cs:gridlineMajor>
+  <cs:gridlineMinor>
+    <cs:lnRef idx="0"/>
+    <cs:fillRef idx="0"/>
+    <cs:effectRef idx="0"/>
+    <cs:fontRef idx="minor">
+      <a:schemeClr val="tx1"/>
+    </cs:fontRef>
+    <cs:spPr>
+      <a:ln w="9525" cap="flat" cmpd="sng" algn="ctr">
+        <a:solidFill>
+          <a:schemeClr val="tx1">
+            <a:lumMod val="5000"/>
+            <a:lumOff val="95000"/>
+          </a:schemeClr>
+        </a:solidFill>
+        <a:round/>
+      </a:ln>
+    </cs:spPr>
+  </cs:gridlineMinor>
+  <cs:hiLoLine>
+    <cs:lnRef idx="0"/>
+    <cs:fillRef idx="0"/>
+    <cs:effectRef idx="0"/>
+    <cs:fontRef idx="minor">
+      <a:schemeClr val="tx1"/>
+    </cs:fontRef>
+    <cs:spPr>
+      <a:ln w="9525" cap="flat" cmpd="sng" algn="ctr">
+        <a:solidFill>
+          <a:schemeClr val="tx1">
+            <a:lumMod val="75000"/>
+            <a:lumOff val="25000"/>
+          </a:schemeClr>
+        </a:solidFill>
+        <a:round/>
+      </a:ln>
+    </cs:spPr>
+  </cs:hiLoLine>
+  <cs:leaderLine>
+    <cs:lnRef idx="0"/>
+    <cs:fillRef idx="0"/>
+    <cs:effectRef idx="0"/>
+    <cs:fontRef idx="minor">
+      <a:schemeClr val="tx1"/>
+    </cs:fontRef>
+    <cs:spPr>
+      <a:ln w="9525" cap="flat" cmpd="sng" algn="ctr">
+        <a:solidFill>
+          <a:schemeClr val="tx1">
+            <a:lumMod val="35000"/>
+            <a:lumOff val="65000"/>
+          </a:schemeClr>
+        </a:solidFill>
+        <a:round/>
+      </a:ln>
+    </cs:spPr>
+  </cs:leaderLine>
+  <cs:legend>
+    <cs:lnRef idx="0"/>
+    <cs:fillRef idx="0"/>
+    <cs:effectRef idx="0"/>
+    <cs:fontRef idx="minor">
+      <a:schemeClr val="tx1">
+        <a:lumMod val="65000"/>
+        <a:lumOff val="35000"/>
+      </a:schemeClr>
+    </cs:fontRef>
+    <cs:defRPr sz="900" kern="1200"/>
+  </cs:legend>
+  <cs:plotArea mods="allowNoFillOverride allowNoLineOverride">
+    <cs:lnRef idx="0"/>
+    <cs:fillRef idx="0"/>
+    <cs:effectRef idx="0"/>
+    <cs:fontRef idx="minor">
+      <a:schemeClr val="tx1"/>
+    </cs:fontRef>
+  </cs:plotArea>
+  <cs:plotArea3D mods="allowNoFillOverride allowNoLineOverride">
+    <cs:lnRef idx="0"/>
+    <cs:fillRef idx="0"/>
+    <cs:effectRef idx="0"/>
+    <cs:fontRef idx="minor">
+      <a:schemeClr val="tx1"/>
+    </cs:fontRef>
+  </cs:plotArea3D>
+  <cs:seriesAxis>
+    <cs:lnRef idx="0"/>
+    <cs:fillRef idx="0"/>
+    <cs:effectRef idx="0"/>
+    <cs:fontRef idx="minor">
+      <a:schemeClr val="tx1">
+        <a:lumMod val="65000"/>
+        <a:lumOff val="35000"/>
+      </a:schemeClr>
+    </cs:fontRef>
+    <cs:defRPr sz="900" kern="1200"/>
+  </cs:seriesAxis>
+  <cs:seriesLine>
+    <cs:lnRef idx="0"/>
+    <cs:fillRef idx="0"/>
+    <cs:effectRef idx="0"/>
+    <cs:fontRef idx="minor">
+      <a:schemeClr val="tx1"/>
+    </cs:fontRef>
+    <cs:spPr>
+      <a:ln w="9525" cap="flat" cmpd="sng" algn="ctr">
+        <a:solidFill>
+          <a:schemeClr val="tx1">
+            <a:lumMod val="35000"/>
+            <a:lumOff val="65000"/>
+          </a:schemeClr>
+        </a:solidFill>
+        <a:round/>
+      </a:ln>
+    </cs:spPr>
+  </cs:seriesLine>
+  <cs:title>
+    <cs:lnRef idx="0"/>
+    <cs:fillRef idx="0"/>
+    <cs:effectRef idx="0"/>
+    <cs:fontRef idx="minor">
+      <a:schemeClr val="tx1">
+        <a:lumMod val="65000"/>
+        <a:lumOff val="35000"/>
+      </a:schemeClr>
+    </cs:fontRef>
+    <cs:defRPr sz="1400" b="0" kern="1200" spc="0" baseline="0"/>
+  </cs:title>
+  <cs:trendline>
+    <cs:lnRef idx="0">
+      <cs:styleClr val="auto"/>
+    </cs:lnRef>
+    <cs:fillRef idx="0"/>
+    <cs:effectRef idx="0"/>
+    <cs:fontRef idx="minor">
+      <a:schemeClr val="tx1"/>
+    </cs:fontRef>
+    <cs:spPr>
+      <a:ln w="19050" cap="rnd">
+        <a:solidFill>
+          <a:schemeClr val="phClr"/>
+        </a:solidFill>
+        <a:prstDash val="sysDot"/>
+      </a:ln>
+    </cs:spPr>
+  </cs:trendline>
+  <cs:trendlineLabel>
+    <cs:lnRef idx="0"/>
+    <cs:fillRef idx="0"/>
+    <cs:effectRef idx="0"/>
+    <cs:fontRef idx="minor">
+      <a:schemeClr val="tx1">
+        <a:lumMod val="65000"/>
+        <a:lumOff val="35000"/>
+      </a:schemeClr>
+    </cs:fontRef>
+    <cs:defRPr sz="900" kern="1200"/>
+  </cs:trendlineLabel>
+  <cs:upBar>
+    <cs:lnRef idx="0"/>
+    <cs:fillRef idx="0"/>
+    <cs:effectRef idx="0"/>
+    <cs:fontRef idx="minor">
+      <a:schemeClr val="dk1"/>
+    </cs:fontRef>
+    <cs:spPr>
+      <a:solidFill>
+        <a:schemeClr val="lt1"/>
+      </a:solidFill>
+      <a:ln w="9525">
+        <a:solidFill>
+          <a:schemeClr val="tx1">
+            <a:lumMod val="15000"/>
+            <a:lumOff val="85000"/>
+          </a:schemeClr>
+        </a:solidFill>
+      </a:ln>
+    </cs:spPr>
+  </cs:upBar>
+  <cs:valueAxis>
+    <cs:lnRef idx="0"/>
+    <cs:fillRef idx="0"/>
+    <cs:effectRef idx="0"/>
+    <cs:fontRef idx="minor">
+      <a:schemeClr val="tx1">
+        <a:lumMod val="65000"/>
+        <a:lumOff val="35000"/>
+      </a:schemeClr>
+    </cs:fontRef>
+    <cs:defRPr sz="900" kern="1200"/>
+  </cs:valueAxis>
+  <cs:wall>
+    <cs:lnRef idx="0"/>
+    <cs:fillRef idx="0"/>
+    <cs:effectRef idx="0"/>
+    <cs:fontRef idx="minor">
+      <a:schemeClr val="tx1"/>
+    </cs:fontRef>
+    <cs:spPr>
+      <a:noFill/>
+      <a:ln>
+        <a:noFill/>
+      </a:ln>
+    </cs:spPr>
+  </cs:wall>
+</cs:chartStyle>
+</file>
+
+<file path=word/charts/style3.xml><?xml version="1.0" encoding="utf-8"?>
+<cs:chartStyle xmlns:cs="http://schemas.microsoft.com/office/drawing/2012/chartStyle" xmlns:a="http://schemas.openxmlformats.org/drawingml/2006/main" id="201">
+  <cs:axisTitle>
+    <cs:lnRef idx="0"/>
+    <cs:fillRef idx="0"/>
+    <cs:effectRef idx="0"/>
+    <cs:fontRef idx="minor">
+      <a:schemeClr val="tx1">
+        <a:lumMod val="65000"/>
+        <a:lumOff val="35000"/>
+      </a:schemeClr>
+    </cs:fontRef>
+    <cs:defRPr sz="1000" kern="1200"/>
+  </cs:axisTitle>
+  <cs:categoryAxis>
+    <cs:lnRef idx="0"/>
+    <cs:fillRef idx="0"/>
+    <cs:effectRef idx="0"/>
+    <cs:fontRef idx="minor">
+      <a:schemeClr val="tx1">
+        <a:lumMod val="65000"/>
+        <a:lumOff val="35000"/>
+      </a:schemeClr>
+    </cs:fontRef>
+    <cs:spPr>
+      <a:ln w="9525" cap="flat" cmpd="sng" algn="ctr">
+        <a:solidFill>
+          <a:schemeClr val="tx1">
+            <a:lumMod val="15000"/>
+            <a:lumOff val="85000"/>
+          </a:schemeClr>
+        </a:solidFill>
+        <a:round/>
+      </a:ln>
+    </cs:spPr>
+    <cs:defRPr sz="900" kern="1200"/>
+  </cs:categoryAxis>
+  <cs:chartArea mods="allowNoFillOverride allowNoLineOverride">
+    <cs:lnRef idx="0"/>
+    <cs:fillRef idx="0"/>
+    <cs:effectRef idx="0"/>
+    <cs:fontRef idx="minor">
+      <a:schemeClr val="tx1"/>
+    </cs:fontRef>
+    <cs:spPr>
+      <a:solidFill>
+        <a:schemeClr val="bg1"/>
+      </a:solidFill>
+      <a:ln w="9525" cap="flat" cmpd="sng" algn="ctr">
+        <a:solidFill>
+          <a:schemeClr val="tx1">
+            <a:lumMod val="15000"/>
+            <a:lumOff val="85000"/>
+          </a:schemeClr>
+        </a:solidFill>
+        <a:round/>
+      </a:ln>
+    </cs:spPr>
+    <cs:defRPr sz="1000" kern="1200"/>
+  </cs:chartArea>
+  <cs:dataLabel>
+    <cs:lnRef idx="0"/>
+    <cs:fillRef idx="0"/>
+    <cs:effectRef idx="0"/>
+    <cs:fontRef idx="minor">
+      <a:schemeClr val="tx1">
+        <a:lumMod val="75000"/>
+        <a:lumOff val="25000"/>
+      </a:schemeClr>
+    </cs:fontRef>
+    <cs:defRPr sz="900" kern="1200"/>
+  </cs:dataLabel>
+  <cs:dataLabelCallout>
+    <cs:lnRef idx="0"/>
+    <cs:fillRef idx="0"/>
+    <cs:effectRef idx="0"/>
+    <cs:fontRef idx="minor">
+      <a:schemeClr val="dk1">
+        <a:lumMod val="65000"/>
+        <a:lumOff val="35000"/>
+      </a:schemeClr>
+    </cs:fontRef>
+    <cs:spPr>
+      <a:solidFill>
+        <a:schemeClr val="lt1"/>
+      </a:solidFill>
+      <a:ln>
+        <a:solidFill>
+          <a:schemeClr val="dk1">
+            <a:lumMod val="25000"/>
+            <a:lumOff val="75000"/>
+          </a:schemeClr>
+        </a:solidFill>
+      </a:ln>
+    </cs:spPr>
+    <cs:defRPr sz="900" kern="1200"/>
+    <cs:bodyPr rot="0" spcFirstLastPara="1" vertOverflow="clip" horzOverflow="clip" vert="horz" wrap="square" lIns="36576" tIns="18288" rIns="36576" bIns="18288" anchor="ctr" anchorCtr="1">
+      <a:spAutoFit/>
+    </cs:bodyPr>
+  </cs:dataLabelCallout>
+  <cs:dataPoint>
+    <cs:lnRef idx="0"/>
+    <cs:fillRef idx="1">
+      <cs:styleClr val="auto"/>
+    </cs:fillRef>
+    <cs:effectRef idx="0"/>
+    <cs:fontRef idx="minor">
+      <a:schemeClr val="tx1"/>
+    </cs:fontRef>
+  </cs:dataPoint>
+  <cs:dataPoint3D>
+    <cs:lnRef idx="0"/>
+    <cs:fillRef idx="1">
+      <cs:styleClr val="auto"/>
+    </cs:fillRef>
+    <cs:effectRef idx="0"/>
+    <cs:fontRef idx="minor">
+      <a:schemeClr val="tx1"/>
+    </cs:fontRef>
+  </cs:dataPoint3D>
+  <cs:dataPointLine>
+    <cs:lnRef idx="0">
+      <cs:styleClr val="auto"/>
+    </cs:lnRef>
+    <cs:fillRef idx="1"/>
+    <cs:effectRef idx="0"/>
+    <cs:fontRef idx="minor">
+      <a:schemeClr val="tx1"/>
+    </cs:fontRef>
+    <cs:spPr>
+      <a:ln w="28575" cap="rnd">
+        <a:solidFill>
+          <a:schemeClr val="phClr"/>
+        </a:solidFill>
+        <a:round/>
+      </a:ln>
+    </cs:spPr>
+  </cs:dataPointLine>
+  <cs:dataPointMarker>
+    <cs:lnRef idx="0">
+      <cs:styleClr val="auto"/>
+    </cs:lnRef>
+    <cs:fillRef idx="1">
+      <cs:styleClr val="auto"/>
+    </cs:fillRef>
+    <cs:effectRef idx="0"/>
+    <cs:fontRef idx="minor">
+      <a:schemeClr val="tx1"/>
+    </cs:fontRef>
+    <cs:spPr>
+      <a:ln w="9525">
+        <a:solidFill>
+          <a:schemeClr val="phClr"/>
+        </a:solidFill>
+      </a:ln>
+    </cs:spPr>
+  </cs:dataPointMarker>
+  <cs:dataPointMarkerLayout symbol="circle" size="5"/>
+  <cs:dataPointWireframe>
+    <cs:lnRef idx="0">
+      <cs:styleClr val="auto"/>
+    </cs:lnRef>
+    <cs:fillRef idx="1"/>
+    <cs:effectRef idx="0"/>
+    <cs:fontRef idx="minor">
+      <a:schemeClr val="tx1"/>
+    </cs:fontRef>
+    <cs:spPr>
+      <a:ln w="9525" cap="rnd">
+        <a:solidFill>
+          <a:schemeClr val="phClr"/>
+        </a:solidFill>
+        <a:round/>
+      </a:ln>
+    </cs:spPr>
+  </cs:dataPointWireframe>
+  <cs:dataTable>
+    <cs:lnRef idx="0"/>
+    <cs:fillRef idx="0"/>
+    <cs:effectRef idx="0"/>
+    <cs:fontRef idx="minor">
+      <a:schemeClr val="tx1">
+        <a:lumMod val="65000"/>
+        <a:lumOff val="35000"/>
+      </a:schemeClr>
+    </cs:fontRef>
+    <cs:spPr>
+      <a:noFill/>
+      <a:ln w="9525" cap="flat" cmpd="sng" algn="ctr">
+        <a:solidFill>
+          <a:schemeClr val="tx1">
+            <a:lumMod val="15000"/>
+            <a:lumOff val="85000"/>
+          </a:schemeClr>
+        </a:solidFill>
+        <a:round/>
+      </a:ln>
+    </cs:spPr>
+    <cs:defRPr sz="900" kern="1200"/>
+  </cs:dataTable>
+  <cs:downBar>
+    <cs:lnRef idx="0"/>
+    <cs:fillRef idx="0"/>
+    <cs:effectRef idx="0"/>
+    <cs:fontRef idx="minor">
+      <a:schemeClr val="dk1"/>
+    </cs:fontRef>
+    <cs:spPr>
+      <a:solidFill>
+        <a:schemeClr val="dk1">
+          <a:lumMod val="65000"/>
+          <a:lumOff val="35000"/>
+        </a:schemeClr>
+      </a:solidFill>
+      <a:ln w="9525">
+        <a:solidFill>
+          <a:schemeClr val="tx1">
+            <a:lumMod val="65000"/>
+            <a:lumOff val="35000"/>
+          </a:schemeClr>
+        </a:solidFill>
+      </a:ln>
+    </cs:spPr>
+  </cs:downBar>
+  <cs:dropLine>
+    <cs:lnRef idx="0"/>
+    <cs:fillRef idx="0"/>
+    <cs:effectRef idx="0"/>
+    <cs:fontRef idx="minor">
+      <a:schemeClr val="tx1"/>
+    </cs:fontRef>
+    <cs:spPr>
+      <a:ln w="9525" cap="flat" cmpd="sng" algn="ctr">
+        <a:solidFill>
+          <a:schemeClr val="tx1">
+            <a:lumMod val="35000"/>
+            <a:lumOff val="65000"/>
+          </a:schemeClr>
+        </a:solidFill>
+        <a:round/>
+      </a:ln>
+    </cs:spPr>
+  </cs:dropLine>
+  <cs:errorBar>
+    <cs:lnRef idx="0"/>
+    <cs:fillRef idx="0"/>
+    <cs:effectRef idx="0"/>
+    <cs:fontRef idx="minor">
+      <a:schemeClr val="tx1"/>
+    </cs:fontRef>
+    <cs:spPr>
+      <a:ln w="9525" cap="flat" cmpd="sng" algn="ctr">
+        <a:solidFill>
+          <a:schemeClr val="tx1">
+            <a:lumMod val="65000"/>
+            <a:lumOff val="35000"/>
+          </a:schemeClr>
+        </a:solidFill>
+        <a:round/>
+      </a:ln>
+    </cs:spPr>
+  </cs:errorBar>
+  <cs:floor>
+    <cs:lnRef idx="0"/>
+    <cs:fillRef idx="0"/>
+    <cs:effectRef idx="0"/>
+    <cs:fontRef idx="minor">
+      <a:schemeClr val="tx1"/>
+    </cs:fontRef>
+    <cs:spPr>
+      <a:noFill/>
+      <a:ln>
+        <a:noFill/>
+      </a:ln>
+    </cs:spPr>
+  </cs:floor>
+  <cs:gridlineMajor>
+    <cs:lnRef idx="0"/>
+    <cs:fillRef idx="0"/>
+    <cs:effectRef idx="0"/>
+    <cs:fontRef idx="minor">
+      <a:schemeClr val="tx1"/>
+    </cs:fontRef>
+    <cs:spPr>
+      <a:ln w="9525" cap="flat" cmpd="sng" algn="ctr">
+        <a:solidFill>
+          <a:schemeClr val="tx1">
+            <a:lumMod val="15000"/>
+            <a:lumOff val="85000"/>
+          </a:schemeClr>
+        </a:solidFill>
+        <a:round/>
+      </a:ln>
+    </cs:spPr>
+  </cs:gridlineMajor>
+  <cs:gridlineMinor>
+    <cs:lnRef idx="0"/>
+    <cs:fillRef idx="0"/>
+    <cs:effectRef idx="0"/>
+    <cs:fontRef idx="minor">
+      <a:schemeClr val="tx1"/>
+    </cs:fontRef>
+    <cs:spPr>
+      <a:ln w="9525" cap="flat" cmpd="sng" algn="ctr">
+        <a:solidFill>
+          <a:schemeClr val="tx1">
+            <a:lumMod val="5000"/>
+            <a:lumOff val="95000"/>
+          </a:schemeClr>
+        </a:solidFill>
+        <a:round/>
+      </a:ln>
+    </cs:spPr>
+  </cs:gridlineMinor>
+  <cs:hiLoLine>
+    <cs:lnRef idx="0"/>
+    <cs:fillRef idx="0"/>
+    <cs:effectRef idx="0"/>
+    <cs:fontRef idx="minor">
+      <a:schemeClr val="tx1"/>
+    </cs:fontRef>
+    <cs:spPr>
+      <a:ln w="9525" cap="flat" cmpd="sng" algn="ctr">
+        <a:solidFill>
+          <a:schemeClr val="tx1">
+            <a:lumMod val="75000"/>
+            <a:lumOff val="25000"/>
+          </a:schemeClr>
+        </a:solidFill>
+        <a:round/>
+      </a:ln>
+    </cs:spPr>
+  </cs:hiLoLine>
+  <cs:leaderLine>
+    <cs:lnRef idx="0"/>
+    <cs:fillRef idx="0"/>
+    <cs:effectRef idx="0"/>
+    <cs:fontRef idx="minor">
+      <a:schemeClr val="tx1"/>
+    </cs:fontRef>
+    <cs:spPr>
+      <a:ln w="9525" cap="flat" cmpd="sng" algn="ctr">
+        <a:solidFill>
+          <a:schemeClr val="tx1">
+            <a:lumMod val="35000"/>
+            <a:lumOff val="65000"/>
+          </a:schemeClr>
+        </a:solidFill>
+        <a:round/>
+      </a:ln>
+    </cs:spPr>
+  </cs:leaderLine>
+  <cs:legend>
+    <cs:lnRef idx="0"/>
+    <cs:fillRef idx="0"/>
+    <cs:effectRef idx="0"/>
+    <cs:fontRef idx="minor">
+      <a:schemeClr val="tx1">
+        <a:lumMod val="65000"/>
+        <a:lumOff val="35000"/>
+      </a:schemeClr>
+    </cs:fontRef>
+    <cs:defRPr sz="900" kern="1200"/>
+  </cs:legend>
+  <cs:plotArea mods="allowNoFillOverride allowNoLineOverride">
+    <cs:lnRef idx="0"/>
+    <cs:fillRef idx="0"/>
+    <cs:effectRef idx="0"/>
+    <cs:fontRef idx="minor">
+      <a:schemeClr val="tx1"/>
+    </cs:fontRef>
+  </cs:plotArea>
+  <cs:plotArea3D mods="allowNoFillOverride allowNoLineOverride">
+    <cs:lnRef idx="0"/>
+    <cs:fillRef idx="0"/>
+    <cs:effectRef idx="0"/>
+    <cs:fontRef idx="minor">
+      <a:schemeClr val="tx1"/>
+    </cs:fontRef>
+  </cs:plotArea3D>
+  <cs:seriesAxis>
+    <cs:lnRef idx="0"/>
+    <cs:fillRef idx="0"/>
+    <cs:effectRef idx="0"/>
+    <cs:fontRef idx="minor">
+      <a:schemeClr val="tx1">
+        <a:lumMod val="65000"/>
+        <a:lumOff val="35000"/>
+      </a:schemeClr>
+    </cs:fontRef>
+    <cs:defRPr sz="900" kern="1200"/>
+  </cs:seriesAxis>
+  <cs:seriesLine>
+    <cs:lnRef idx="0"/>
+    <cs:fillRef idx="0"/>
+    <cs:effectRef idx="0"/>
+    <cs:fontRef idx="minor">
+      <a:schemeClr val="tx1"/>
+    </cs:fontRef>
+    <cs:spPr>
+      <a:ln w="9525" cap="flat" cmpd="sng" algn="ctr">
+        <a:solidFill>
+          <a:schemeClr val="tx1">
+            <a:lumMod val="35000"/>
+            <a:lumOff val="65000"/>
+          </a:schemeClr>
+        </a:solidFill>
+        <a:round/>
+      </a:ln>
+    </cs:spPr>
+  </cs:seriesLine>
+  <cs:title>
+    <cs:lnRef idx="0"/>
+    <cs:fillRef idx="0"/>
+    <cs:effectRef idx="0"/>
+    <cs:fontRef idx="minor">
+      <a:schemeClr val="tx1">
+        <a:lumMod val="65000"/>
+        <a:lumOff val="35000"/>
+      </a:schemeClr>
+    </cs:fontRef>
+    <cs:defRPr sz="1400" b="0" kern="1200" spc="0" baseline="0"/>
+  </cs:title>
+  <cs:trendline>
+    <cs:lnRef idx="0">
+      <cs:styleClr val="auto"/>
+    </cs:lnRef>
+    <cs:fillRef idx="0"/>
+    <cs:effectRef idx="0"/>
+    <cs:fontRef idx="minor">
+      <a:schemeClr val="tx1"/>
+    </cs:fontRef>
+    <cs:spPr>
+      <a:ln w="19050" cap="rnd">
+        <a:solidFill>
+          <a:schemeClr val="phClr"/>
+        </a:solidFill>
+        <a:prstDash val="sysDot"/>
+      </a:ln>
+    </cs:spPr>
+  </cs:trendline>
+  <cs:trendlineLabel>
+    <cs:lnRef idx="0"/>
+    <cs:fillRef idx="0"/>
+    <cs:effectRef idx="0"/>
+    <cs:fontRef idx="minor">
+      <a:schemeClr val="tx1">
+        <a:lumMod val="65000"/>
+        <a:lumOff val="35000"/>
+      </a:schemeClr>
+    </cs:fontRef>
+    <cs:defRPr sz="900" kern="1200"/>
+  </cs:trendlineLabel>
+  <cs:upBar>
+    <cs:lnRef idx="0"/>
+    <cs:fillRef idx="0"/>
+    <cs:effectRef idx="0"/>
+    <cs:fontRef idx="minor">
+      <a:schemeClr val="dk1"/>
+    </cs:fontRef>
+    <cs:spPr>
+      <a:solidFill>
+        <a:schemeClr val="lt1"/>
+      </a:solidFill>
+      <a:ln w="9525">
+        <a:solidFill>
+          <a:schemeClr val="tx1">
+            <a:lumMod val="15000"/>
+            <a:lumOff val="85000"/>
+          </a:schemeClr>
+        </a:solidFill>
+      </a:ln>
+    </cs:spPr>
+  </cs:upBar>
+  <cs:valueAxis>
+    <cs:lnRef idx="0"/>
+    <cs:fillRef idx="0"/>
+    <cs:effectRef idx="0"/>
+    <cs:fontRef idx="minor">
+      <a:schemeClr val="tx1">
+        <a:lumMod val="65000"/>
+        <a:lumOff val="35000"/>
+      </a:schemeClr>
+    </cs:fontRef>
+    <cs:defRPr sz="900" kern="1200"/>
+  </cs:valueAxis>
+  <cs:wall>
+    <cs:lnRef idx="0"/>
+    <cs:fillRef idx="0"/>
+    <cs:effectRef idx="0"/>
+    <cs:fontRef idx="minor">
+      <a:schemeClr val="tx1"/>
+    </cs:fontRef>
+    <cs:spPr>
+      <a:noFill/>
+      <a:ln>
+        <a:noFill/>
+      </a:ln>
+    </cs:spPr>
+  </cs:wall>
+</cs:chartStyle>
+</file>
+
+<file path=word/charts/style4.xml><?xml version="1.0" encoding="utf-8"?>
 <cs:chartStyle xmlns:cs="http://schemas.microsoft.com/office/drawing/2012/chartStyle" xmlns:a="http://schemas.openxmlformats.org/drawingml/2006/main" id="201">
   <cs:axisTitle>
     <cs:lnRef idx="0"/>

</xml_diff>

<commit_message>
update: task 3 L value
</commit_message>
<xml_diff>
--- a/week-3/Tugas2_MuhamadFaqihAzhar_0110221092_5TI01.docx
+++ b/week-3/Tugas2_MuhamadFaqihAzhar_0110221092_5TI01.docx
@@ -2402,7 +2402,19 @@
               <w:rPr>
                 <w:rFonts w:ascii="Courier New" w:hAnsi="Courier New" w:cs="Courier New"/>
               </w:rPr>
-              <w:t>(3 – 1) × 0.375</w:t>
+              <w:t>(</w:t>
+            </w:r>
+            <w:r>
+              <w:rPr>
+                <w:rFonts w:ascii="Courier New" w:hAnsi="Courier New" w:cs="Courier New"/>
+              </w:rPr>
+              <w:t>4</w:t>
+            </w:r>
+            <w:r>
+              <w:rPr>
+                <w:rFonts w:ascii="Courier New" w:hAnsi="Courier New" w:cs="Courier New"/>
+              </w:rPr>
+              <w:t xml:space="preserve"> – 1) × 0.375</w:t>
             </w:r>
           </w:p>
         </w:tc>
@@ -2754,7 +2766,19 @@
               <w:rPr>
                 <w:rFonts w:ascii="Courier New" w:hAnsi="Courier New" w:cs="Courier New"/>
               </w:rPr>
-              <w:t>(3 – 1) × (0.375 + 0.3125)</w:t>
+              <w:t>(</w:t>
+            </w:r>
+            <w:r>
+              <w:rPr>
+                <w:rFonts w:ascii="Courier New" w:hAnsi="Courier New" w:cs="Courier New"/>
+              </w:rPr>
+              <w:t>4</w:t>
+            </w:r>
+            <w:r>
+              <w:rPr>
+                <w:rFonts w:ascii="Courier New" w:hAnsi="Courier New" w:cs="Courier New"/>
+              </w:rPr>
+              <w:t xml:space="preserve"> – 1) × (0.375 + 0.3125)</w:t>
             </w:r>
           </w:p>
         </w:tc>
@@ -3117,7 +3141,19 @@
               <w:rPr>
                 <w:rFonts w:ascii="Courier New" w:hAnsi="Courier New" w:cs="Courier New"/>
               </w:rPr>
-              <w:t>(3 – 1) × (0.375 + 0.3125 + 0.25)</w:t>
+              <w:t>(</w:t>
+            </w:r>
+            <w:r>
+              <w:rPr>
+                <w:rFonts w:ascii="Courier New" w:hAnsi="Courier New" w:cs="Courier New"/>
+              </w:rPr>
+              <w:t>4</w:t>
+            </w:r>
+            <w:r>
+              <w:rPr>
+                <w:rFonts w:ascii="Courier New" w:hAnsi="Courier New" w:cs="Courier New"/>
+              </w:rPr>
+              <w:t xml:space="preserve"> – 1) × (0.375 + 0.3125 + 0.25)</w:t>
             </w:r>
           </w:p>
         </w:tc>
@@ -3491,7 +3527,19 @@
               <w:rPr>
                 <w:rFonts w:ascii="Courier New" w:hAnsi="Courier New" w:cs="Courier New"/>
               </w:rPr>
-              <w:t>(3 – 1) × (0.375 + 0.3125 + 0.25 + 0.0625)</w:t>
+              <w:t>(</w:t>
+            </w:r>
+            <w:r>
+              <w:rPr>
+                <w:rFonts w:ascii="Courier New" w:hAnsi="Courier New" w:cs="Courier New"/>
+              </w:rPr>
+              <w:t>4</w:t>
+            </w:r>
+            <w:r>
+              <w:rPr>
+                <w:rFonts w:ascii="Courier New" w:hAnsi="Courier New" w:cs="Courier New"/>
+              </w:rPr>
+              <w:t xml:space="preserve"> – 1) × (0.375 + 0.3125 + 0.25 + 0.0625)</w:t>
             </w:r>
           </w:p>
         </w:tc>

</xml_diff>